<commit_message>
Preprint v3: T2 (dated temporal test) and T3 (TxGNN on the same dated graph); exports updated
</commit_message>
<xml_diff>
--- a/docs/preprint/OREVID_preprint_v3_draft.docx
+++ b/docs/preprint/OREVID_preprint_v3_draft.docx
@@ -86,7 +86,7 @@
         <w:t xml:space="preserve">Results.</w:t>
       </w:r>
       <w:r>
-        <w:t xml:space="preserve"> Zero-shot Recall@100 (mean ± SD over five splits) was 0.811 ± 0.042 for OREVID, 0.412 ± 0.042 for TxGNN and 0.358 ± 0.040 for a popularity baseline, with OREVID ahead on every split (paired difference with TxGNN 0.399, 95% CI 0.352–0.443, resampling diseases). On nine disease areas held out it was 0.617 against 0.237, ahead in all nine, although TxGNN had the higher AUPRC in five. Training OREVID without validation labels and excluding diseases where TxGNN outputs constant scores gave 0.809 against 0.421. On 3,718 approvals absent from PrimeKG, Recall@100 was 0.359 against 0.121 (0.367 ± 0.008 against 0.126 ± 0.004 over five training splits), and 0.178 against 0.085 for the 2,719 approvals not obvious from the disease ontology; a logistic regression without the drug-popularity feature and a model without any Open Targets feature (0.348) performed similarly. Of the candidates the website's rules select in this external exam, 12.6% (95% CI 9.8–15.6%, resampling diseases) of direct extensions and 4.4% (3.2–5.8%) of shared-genes candidates were among the unseen approvals, against about 0.07% by chance; random gene sets of the same size selected candidates that were right as often, so the shared genes are not evidence of a shared mechanism, although they contained a protein of the curated mechanism (DrugMechDB) more often than random genes of the same disease (25% against 17%). A drug acting on a disease gene, with no other evidence, was right 1.8–3.4% of the time, no better than candidates with no evidence line at all. With the graph and the model rebuilt as known in 2015, the uses that later reached phase 3 or approval had a Recall@100 of 0.322 against 0.174 for popularity (paired difference 0.148, 95% CI 0.123–0.173), a pre-registered test.</w:t>
+        <w:t xml:space="preserve"> Zero-shot Recall@100 (mean ± SD over five splits) was 0.811 ± 0.042 for OREVID, 0.412 ± 0.042 for TxGNN and 0.358 ± 0.040 for a popularity baseline, with OREVID ahead on every split (paired difference with TxGNN 0.399, 95% CI 0.352–0.443, resampling diseases). On nine disease areas held out it was 0.617 against 0.237, ahead in all nine, although TxGNN had the higher AUPRC in five. Training OREVID without validation labels and excluding diseases where TxGNN outputs constant scores gave 0.809 against 0.421. On 3,718 approvals absent from PrimeKG, Recall@100 was 0.359 against 0.121 (0.367 ± 0.008 against 0.126 ± 0.004 over five training splits), and 0.178 against 0.085 for the 2,719 approvals not obvious from the disease ontology; a logistic regression without the drug-popularity feature and a model without any Open Targets feature (0.348) performed similarly. Of the candidates the website's rules select in this external exam, 12.6% (95% CI 9.8–15.6%, resampling diseases) of direct extensions and 4.4% (3.2–5.8%) of shared-genes candidates were among the unseen approvals, against about 0.07% by chance; random gene sets of the same size selected candidates that were right as often, so the shared genes are not evidence of a shared mechanism, although they contained a protein of the curated mechanism (DrugMechDB) more often than random genes of the same disease (25% against 17%). A drug acting on a disease gene, with no other evidence, was right 1.8–3.4% of the time, no better than candidates with no evidence line at all. With the graph and the model rebuilt as known in 2015 and every drug dated by its first approval, the uses that later reached phase 3 or approval had a Recall@100 of 0.286 against 0.181 for popularity (paired difference 0.105, 95% CI 0.081–0.128) and 0.117 for TxGNN trained on the same graph (difference 0.169, 0.145–0.194), in pre-registered tests.</w:t>
       </w:r>
     </w:p>
     <w:p>
@@ -317,7 +317,7 @@
         <w:t xml:space="preserve">Temporal validation.</w:t>
       </w:r>
       <w:r>
-        <w:t xml:space="preserve"> To test the prediction of later uses, the graph was rebuilt as it was known at a cutoff year: PrimeKG drug–disease edges whose first trial in Open Targets started at or after the cutoff, and Open Targets gene–disease associations first reported after it, were removed, and the model, the popularity baseline and the logistic regression were retrained on that graph. Positives were drug–disease pairs whose first trial started at or after the cutoff and that reached phase 3 or approval by Open Targets 26.06, excluding pairs already linked in the cutoff graph. The 2012 cutoff was used for development and 2015 for confirmation. The decision rule (claim an advantage only if the paired OREVID − popularity difference in Recall@100 at 2015 had a 95% interval excluding 0) and the secondary analyses were registered before running (docs/IMPROVEMENT_PLAN.md).</w:t>
+        <w:t xml:space="preserve"> To test the prediction of later uses, the graph was rebuilt as it was known at a cutoff year: PrimeKG drug–disease edges whose first trial in Open Targets started at or after the cutoff, and Open Targets gene–disease associations first reported after it, were removed, and the model, the popularity baseline and the logistic regression were retrained on that graph. Positives were drug–disease pairs whose first trial started at or after the cutoff and that reached phase 3 or approval by Open Targets 26.06, excluding pairs already linked in the cutoff graph. The 2012 cutoff was used for development and 2015 for confirmation. The decision rule (claim an advantage only if the paired OREVID − popularity difference in Recall@100 at 2015 had a 95% interval excluding 0) and the secondary analyses were registered before running (docs/IMPROVEMENT_PLAN.md). Because 80% of PrimeKG indications carry no date, a second pre-registered version dated every drug by its first approval in DrugCentral [24] and also removed all drug–disease edges of drugs first approved at or after the cutoff, leaving 11% of indications undated. TxGNN was then trained with its official code and the benchmark's hyperparameters on exactly that dated cutoff graph (the removed edges marked as test in its own split, so it never trained on them) and scored on the same test diseases, candidates and positives.</w:t>
       </w:r>
     </w:p>
     <w:p>
@@ -2367,7 +2367,7 @@
     <w:p>
       <w:pPr/>
       <w:r>
-        <w:t xml:space="preserve">Rebuilt as known in 2015, OREVID ranked the uses that later reached phase 3 or approval well above popularity (813 test diseases, 2,832 pairs; Recall@100 0.322 against 0.174, paired difference 0.148, 95% CI 0.123–0.173), meeting the pre-registered rule; the development cutoff (2012) gave the same result (0.324 against 0.175). The difference held for pairs with no PrimeKG drug–disease edge of any kind (0.117, 0.093–0.142), for confirmed approvals (0.525 against 0.226) and for a model without any Open Targets feature (0.135), but it was small for non-obvious uses (0.043, 0.022–0.066). Among the 25 highest-ranked drugs per disease, 5.4% of direct extensions, 3.1% of shared-genes candidates and 0.8% of hidden drugs later reached phase 3 or approval, the same ordering as in the external exam. A logistic model that turned section, rank and gene-set size into a calibrated probability improved the Brier score over the section rates by only 2.5% (pre-registered threshold 5%) and is not used.</w:t>
+        <w:t xml:space="preserve">Rebuilt as known in 2015, OREVID ranked the uses that later reached phase 3 or approval above popularity, by less than first measured. In the first design (813 test diseases, 2,832 pairs) Recall@100 was 0.322 against 0.174 (paired difference 0.148, 95% CI 0.123–0.173), meeting the pre-registered rule, and the difference held for pairs with no PrimeKG drug–disease edge of any kind (0.117, 0.093–0.142) and for a model without any Open Targets feature (0.135). With every drug dated by its first approval (11% of PrimeKG indications undated instead of 80%), it was 0.286 against 0.181 (0.105, 0.081–0.128), so about a third of the first estimate came from later indications left in the training graph; the development cutoff (2012) agreed (0.114, 0.094–0.134). TxGNN, trained on exactly the same dated 2015 graph, reached 0.117, below popularity (OREVID − TxGNN 0.169, 0.145–0.194; at 2012 0.180, 0.157–0.203). On the dated test OREVID's advantage held for confirmed approvals (0.415 against 0.216 for popularity and 0.168 for TxGNN) but was small for non-obvious uses (0.024, 0.002–0.046); for drugs first approved after the cutoff, which had no use in the graph, 6.6% of their later uses were in OREVID's top 100, against 2.4% for TxGNN and 1.3% by chance. Among the 25 highest-ranked drugs per disease (first design), 5.4% of direct extensions, 3.1% of shared-genes candidates and 0.8% of hidden drugs later reached phase 3 or approval, the same ordering as in the external exam. A logistic model that turned section, rank and gene-set size into a calibrated probability improved the Brier score over the section rates by only 2.5% (pre-registered threshold 5%) and is not used.</w:t>
       </w:r>
     </w:p>
     <w:p>
@@ -2453,7 +2453,7 @@
         <w:t xml:space="preserve">Limitations.</w:t>
       </w:r>
       <w:r>
-        <w:t xml:space="preserve"> All tests use recorded approvals as truth, which favours known treatments and penalises valid uses that were never approved. The external exam is out of sample but not prospective: most of those approvals predate PrimeKG and are simply missing from it. The temporal test removes later trials and associations from the graph, but 80% of PrimeKG indications carry no date and stay in the training graph, so some later knowledge may leak, and its advantage on non-obvious uses was small. The disease areas were used while designing both the model and the evidence rules, so they are not an untouched test set, and the threshold that defines the hard subset (half of the drugs already in a neighbour) was set by hand. Open Targets supplies gene–disease features as well as the external labels, although removing every Open Targets feature changed the external Recall@100 by only 0.011. Errors in the sources propagate, including wrong gene–disease associations and comorbidities that read as shared biology. Subtypes defined by a biomarker are not represented by that marker in the graph; a curated rule removes drugs acting on an absent marker for the listed subtypes (tamoxifen no longer appears for triple-negative breast cancer), but markers outside that list, and subtypes defined by mutations the graph does not encode, can still inherit treatments that cannot work. Broad terms with many associated genes (breast cancer has 1,253) pass the shared-genes test with almost any cancer; their shared-genes candidates were still right more often than hidden ones on the external exam (4.6% against 1.5%), so they are kept, but they may apply only to one subtype, which the pages now say. The risk warning relies on recorded contraindications, gives no signal when the drug has no label in related diseases, and cannot detect opposite mechanisms or class toxicities; the direction of effect of a new drug is not predicted. Drugs with no prior indication remain beyond the reach of every model tested; a pre-registered test of expression-signature reversal (LINCS L1000 consensus signatures against GEO disease signatures, 2,410 drugs and 239 diseases) ranked them at chance at the 2015 cutoff. Three pre-registered replacements for the shared-genes line (shared enriched Reactome pathways, specificity-weighted genes, genetic evidence only) did not beat the permutation null on the external exam either, although pathway overlap selected fewer candidates with a higher hit rate in every test (5.0% against 4.3% on the external exam). Network proximity between drug targets and disease genes [23] ranked drugs with no prior use above random at the 2015 cutoff (Recall@100 0.061 against 0.018) but below OREVID's own ranking of the same drugs (0.133), and as an added feature it did not pass its pre-registered rule. Restricting the shared genes to curated gene–disease validity (GenCC [22]) raised the external hit rate to 4.8% but removed correct candidates on the benchmark, and covers few diseases. An audit of drug status against current FDA and EMA labels is not yet shown on the website: its first version failed a manual check. Disease-area splits use one seed and approximate TxGNN's, which were drawn without a fixed seed. The reviews that led to some of the website's rules were done by AI agents, not by human experts (see Use of AI).</w:t>
+        <w:t xml:space="preserve"> All tests use recorded approvals as truth, which favours known treatments and penalises valid uses that were never approved. The external exam is out of sample but not prospective: most of those approvals predate PrimeKG and are simply missing from it. The temporal test removes later trials and associations from the graph; in its first design 80% of PrimeKG indications carried no date and stayed in the training graph, which inflated the advantage by about a third. Dating drugs by their first approval leaves 11% undated (indications added later to old drugs), so some later knowledge may still leak, and the advantage on non-obvious uses is small. The disease areas were used while designing both the model and the evidence rules, so they are not an untouched test set, and the threshold that defines the hard subset (half of the drugs already in a neighbour) was set by hand. Open Targets supplies gene–disease features as well as the external labels, although removing every Open Targets feature changed the external Recall@100 by only 0.011. Errors in the sources propagate, including wrong gene–disease associations and comorbidities that read as shared biology. Subtypes defined by a biomarker are not represented by that marker in the graph; a curated rule removes drugs acting on an absent marker for the listed subtypes (tamoxifen no longer appears for triple-negative breast cancer), but markers outside that list, and subtypes defined by mutations the graph does not encode, can still inherit treatments that cannot work. Broad terms with many associated genes (breast cancer has 1,253) pass the shared-genes test with almost any cancer; their shared-genes candidates were still right more often than hidden ones on the external exam (4.6% against 1.5%), so they are kept, but they may apply only to one subtype, which the pages now say. The risk warning relies on recorded contraindications, gives no signal when the drug has no label in related diseases, and cannot detect opposite mechanisms or class toxicities; the direction of effect of a new drug is not predicted. Drugs with no prior indication remain beyond the reach of every model tested; a pre-registered test of expression-signature reversal (LINCS L1000 consensus signatures against GEO disease signatures, 2,410 drugs and 239 diseases) ranked them at chance at the 2015 cutoff. Three pre-registered replacements for the shared-genes line (shared enriched Reactome pathways, specificity-weighted genes, genetic evidence only) did not beat the permutation null on the external exam either, although pathway overlap selected fewer candidates with a higher hit rate in every test (5.0% against 4.3% on the external exam). Network proximity between drug targets and disease genes [23] ranked drugs with no prior use above random at the 2015 cutoff (Recall@100 0.061 against 0.018) but below OREVID's own ranking of the same drugs (0.133), and as an added feature it did not pass its pre-registered rule. Restricting the shared genes to curated gene–disease validity (GenCC [22]) raised the external hit rate to 4.8% but removed correct candidates on the benchmark, and covers few diseases. An audit of drug status against current FDA and EMA labels is not yet shown on the website: its first version failed a manual check. Disease-area splits use one seed and approximate TxGNN's, which were drawn without a fixed seed. The reviews that led to some of the website's rules were done by AI agents, not by human experts (see Use of AI).</w:t>
       </w:r>
     </w:p>
     <w:p>
@@ -2995,6 +2995,18 @@
       </w:pPr>
       <w:r>
         <w:t xml:space="preserve">Guney E, Menche J, Vidal M, Barabási AL. Network-based in silico drug efficacy screening. Nat Commun. 2016;7:10331. doi:10.1038/ncomms10331</w:t>
+      </w:r>
+    </w:p>
+    <w:p>
+      <w:pPr>
+        <w:pStyle w:val="ListParagraph"/>
+        <w:numPr>
+          <w:ilvl w:val="0"/>
+          <w:numId w:val="2"/>
+        </w:numPr>
+      </w:pPr>
+      <w:r>
+        <w:t xml:space="preserve">Avram S, Wilson TB, Curpan R, Halip L, Borota A, Bora A, et al. DrugCentral 2023 extends human clinical data and integrates veterinary drugs. Nucleic Acids Res. 2023;51(D1):D1276–D1287. doi:10.1093/nar/gkac1085</w:t>
       </w:r>
     </w:p>
     <w:p>

</xml_diff>

<commit_message>
Preprint v3 rewritten for the production model (extra_qtl_orpha): all evaluations recomputed, independent exams section, website lines, limitations; xgb training cache keyed by feature set
</commit_message>
<xml_diff>
--- a/docs/preprint/OREVID_preprint_v3_draft.docx
+++ b/docs/preprint/OREVID_preprint_v3_draft.docx
@@ -74,7 +74,7 @@
         <w:t xml:space="preserve">Methods.</w:t>
       </w:r>
       <w:r>
-        <w:t xml:space="preserve"> The graph combines PrimeKG, Open Targets, STRING and PubTator3 (157,822 nodes, 9.46 million edges). For each disease, 22 degree-weighted metapath features feed a LightGBM LambdaRank model trained with masked neighbourhoods. A candidate is shown only if it is indicated for an ontology-neighbour disease or for a disease sharing at least 3 associated genes (hypergeometric p &lt; 10⁻⁵ over the genes with at least one associated disease). The acceptance criteria for these rules were set in advance; the rules were revised on the hidden-treatment benchmarks and then measured on an external set of approvals not used to choose them. TxGNN was retrained with its official code on the same PrimeKG splits, and all tasks and predictions are released as OREVID-bench.</w:t>
+        <w:t xml:space="preserve"> The graph combines PrimeKG, Open Targets, STRING and PubTator3 (157,822 nodes, 9.46 million edges). For each disease, 22 degree-weighted metapath features and two gene-level columns (whether the drug moves its targets in the direction human genetics asks, from protein and expression QTLs that colocalise with the disease's genome-wide association studies, and whether it acts on a gene Orphanet lists for the disease) feed a LightGBM LambdaRank model trained with masked neighbourhoods. A candidate is shown only if it is indicated for an ontology-neighbour disease or for a disease sharing at least 3 associated genes (hypergeometric p &lt; 10⁻⁵ over the genes with at least one associated disease). The acceptance criteria for these rules were set in advance; the rules were revised on the hidden-treatment benchmarks and then measured on an external set of approvals not used to choose them. TxGNN was retrained with its official code on the same PrimeKG splits, and all tasks and predictions are released as OREVID-bench.</w:t>
       </w:r>
     </w:p>
     <w:p>
@@ -86,7 +86,7 @@
         <w:t xml:space="preserve">Results.</w:t>
       </w:r>
       <w:r>
-        <w:t xml:space="preserve"> Zero-shot Recall@100 (mean ± SD over five splits) was 0.811 ± 0.042 for OREVID, 0.412 ± 0.042 for TxGNN and 0.358 ± 0.040 for a popularity baseline, with OREVID ahead on every split (paired difference with TxGNN 0.399, 95% CI 0.352–0.443, resampling diseases). On nine disease areas held out it was 0.617 against 0.237, ahead in all nine, although TxGNN had the higher AUPRC in five. Training OREVID without validation labels and excluding diseases where TxGNN outputs constant scores gave 0.809 against 0.421. On 3,718 approvals absent from PrimeKG, Recall@100 was 0.359 against 0.121 (0.367 ± 0.008 against 0.126 ± 0.004 over five training splits), and 0.178 against 0.085 for the 2,719 approvals not obvious from the disease ontology; a logistic regression without the drug-popularity feature and a model without any Open Targets feature (0.348) performed similarly. Of the candidates the website's rules select in this external exam, 12.6% (95% CI 9.8–15.6%, resampling diseases) of direct extensions and 4.4% (3.2–5.8%) of shared-genes candidates were among the unseen approvals, against about 0.07% by chance; random gene sets of the same size selected candidates that were right as often, so the shared genes are not evidence of a shared mechanism, although they contained a protein of the curated mechanism (DrugMechDB) more often than random genes of the same disease (25% against 17%). A drug acting on a disease gene, with no other evidence, was right 1.8–3.4% of the time, no better than candidates with no evidence line at all. With the graph and the model rebuilt as known in 2015 and every drug dated by its first approval, the uses that later reached phase 3 or approval had a Recall@100 of 0.286 against 0.181 for popularity (paired difference 0.105, 95% CI 0.081–0.128) and 0.117 for TxGNN trained on the same graph (difference 0.169, 0.145–0.194), in pre-registered tests.</w:t>
+        <w:t xml:space="preserve"> Zero-shot Recall@100 (mean ± SD over five splits) was 0.812 ± 0.038 for OREVID, 0.412 ± 0.042 for TxGNN and 0.358 ± 0.040 for a popularity baseline, with OREVID ahead on every split (paired difference with TxGNN 0.400, 95% CI 0.354–0.444, resampling diseases). On nine disease areas held out it was 0.627 against 0.237, ahead in all nine, although TxGNN had the higher AUPRC in four. Training OREVID without validation labels and excluding diseases where TxGNN outputs constant scores gave 0.815 against 0.421. On 3,718 approvals absent from PrimeKG, Recall@100 was 0.355 against 0.121 (0.366 ± 0.011 against 0.126 ± 0.004 over five training splits), and 0.175 against 0.085 for the 2,719 approvals not obvious from the disease ontology; a logistic regression without the drug-popularity feature and a model without any Open Targets feature (0.348) performed similarly. Of the candidates the website's rules select in this external exam, 12.6% (95% CI 9.8–15.5%, resampling diseases) of direct extensions and 4.4% (3.2–5.8%) of shared-genes candidates were among the unseen approvals, against about 0.07% by chance; random gene sets of the same size selected candidates that were right as often, so the shared genes are not evidence of a shared mechanism, although they contained a protein of the curated mechanism (DrugMechDB) more often than random genes of the same disease (25% against 17%). A drug acting on a disease gene, with no other evidence, was right 1.8–3.4% of the time, no better than candidates with no evidence line at all. With the graph and the model rebuilt as known in 2015 and every drug dated by its first approval, the uses that later reached phase 3 or approval had a Recall@100 of 0.283 against 0.181 for popularity (paired difference 0.102, 95% CI 0.078–0.126) and 0.117 for TxGNN trained on the same graph (difference 0.167, 0.142–0.192), in pre-registered tests. On labels absent from the graph (CIViC oncology evidence, indications only DrugCentral or MED-RT record, and European orphan designations) OREVID was ahead of popularity by 0.32, 0.27 and 0.16, but the candidates the website shows did not meet trial end points more often than ranked drugs it hides.</w:t>
       </w:r>
     </w:p>
     <w:p>
@@ -200,7 +200,7 @@
     <w:p>
       <w:pPr/>
       <w:r>
-        <w:t xml:space="preserve">The graph merges PrimeKG [4] (Harvard Dataverse, doi:10.7910/DVN/IXA7BM), which aggregates DrugBank [11], SIDER [12], DisGeNET [13], MONDO [14] and other sources, with Open Targets Platform release 26.06 [15] (drug mechanisms with direction from ChEMBL [16], clinical stage and year per drug–disease pair, trials stopped for efficacy or safety, gene–disease evidence by type) and STRING 12.5 [17] (interactions with confidence ≥ 700). The result has 157,822 nodes and 9,457,076 undirected edges. Relations mined from the literature with PubTator3 [18] are shown to users as context but never enter features or evaluation, because «drug treats disease» is the answer being predicted. Release 26.06 of Open Targets was used because in 26.09 multiple sclerosis was merged into a measurement term; the issue was reported upstream. Supplementary Table S1 lists which relations are model features and which are only displayed.</w:t>
+        <w:t xml:space="preserve">The graph merges PrimeKG [4] (Harvard Dataverse, doi:10.7910/DVN/IXA7BM), which aggregates DrugBank [11], SIDER [12], DisGeNET [13], MONDO [14] and other sources, with Open Targets Platform release 26.06 [15] (drug mechanisms with direction from ChEMBL [16], clinical stage and year per drug–disease pair, trials stopped for efficacy or safety, gene–disease evidence by type) and STRING 12.5 [17] (interactions with confidence ≥ 700). The result has 157,822 nodes and 9,457,076 undirected edges. Relations mined from the literature with PubTator3 [18] are shown to users as context but never enter features or evaluation, because «drug treats disease» is the answer being predicted. Release 26.06 of Open Targets was used because in 26.09 multiple sclerosis was merged into a measurement term; the issue was reported upstream. Two further inputs feed one model column each and are not edges of the graph: the colocalisations of Open Targets 26.06 between protein or expression QTLs and disease association studies, and the disease–gene associations of Orphanet (Orphadata, CC BY 4.0) [25]. Supplementary Table S1 lists which relations are model features and which are only displayed.</w:t>
       </w:r>
     </w:p>
     <w:p>
@@ -247,6 +247,12 @@
     <w:p>
       <w:pPr/>
       <w:r>
+        <w:t xml:space="preserve">Two gene-level columns were added on 24 October 2026. The first is the direction of human genetics: for each of the drug's targets that it lowers or raises (ChEMBL action types), a cis protein or expression QTL that colocalises with an association study of the disease (posterior probability of a shared variant h4 ≥ 0.8) gives the sign of the effect of a higher level of the protein on disease risk, and the column counts the targets the drug moves in the direction that lowers risk minus those it moves the other way. Across 1,351 diseases, drugs already used for a disease agreed with this direction 5.1 times more often than they disagreed (95% CI 2.5–12.3; 117 indicated pairs). The second counts the drug's targets among the genes Orphanet lists for the disease (graph diseases with a single MONDO identifier). Neither column uses a drug–disease edge, so both carry the same value in every split. Each was tested against the model of the time with a pre-registered rule; neither met it (as features they applied to few benchmark diseases and changed Recall@100 by −0.000 to +0.008), and both were adopted by the author's decision because they did not lower the benchmark and helped where they applied; Results report the model with both.</w:t>
+      </w:r>
+    </w:p>
+    <w:p>
+      <w:pPr/>
+      <w:r>
         <w:t xml:space="preserve">A LightGBM LambdaRank model [19,20] (300 trees, learning rate 0.05, 31 leaves, at least 50 rows per leaf, L2 regularisation 1) learns to order drugs within each disease from 1,500 training diseases (all positives, 10% of negatives). To train under test-like conditions, five additional rounds each pick 40 seed diseases, hide their neighbourhoods (diseases up to two ontology steps away or with a gene-set Jaccard similarity ≥ 0.5; neighbourhoods of more than 400 diseases are skipped) and add those diseases as training groups. Test diseases never enter training. For display, scores are standardised per disease and reduced by 0.5 times the drug's mean standardised score over 2,000 reference diseases, which removes drugs that rank high everywhere at a cost of about 0.01 in Recall@100. For comparison, a class-balanced logistic regression on the same metapath features, without the popularity feature, was trained on the same rows; it also ranks the exploratory list described below.</w:t>
       </w:r>
     </w:p>
@@ -261,7 +267,7 @@
     <w:p>
       <w:pPr/>
       <w:r>
-        <w:t xml:space="preserve">Of the 25 highest-ranked candidates that are not already approved for the disease, a candidate is shown only if it is indicated for an ontology-neighbour disease («direct extension») or for a disease sharing at least 3 associated genes with a hypergeometric p &lt; 10⁻⁵, the population being the genes with at least one associated disease (19,735) except the 55 associated with 500 or more diseases («shared genes»). These hub genes, mostly developmental genes of rare syndromes such as FGFR3, GLI3 and TP53, count neither in the number of shared genes nor in the test; the rule was pre-registered and adopted after the first version, because the candidates they alone brought were right 1–3% of the time, like hidden ones. Every other candidate is hidden. An earlier version also counted the diseases in that population, which made p-values too small; when this was corrected, the threshold was re-matched from 10⁻⁶ to 10⁻⁵ to keep the validated selection (97% agreement on the benchmark and areas; on the external exam 4.3% against 4.2% of candidates correct, with 4% fewer candidates), and all figures here use the corrected test. The acceptance criteria were fixed in advance: an evidence line had to separate correct from incorrect candidates on both the zero-shot benchmark (seeds 1–5) and the nine held-out disease areas, and a filter was applied only if the subset it removed had a hit rate below 5% in both. The rules themselves were revised in three rounds, each evaluated on both datasets, so the areas are not an untouched confirmation set. The external exam was used only as a confirmation set, together with the other splits, for two design decisions (the weight of the specificity correction and the removal of one data source, CTD), and never to choose an evidence rule. Neither decision moved the external result much: with CTD kept, as before the external set was consulted, OREVID's Recall@100 there was 0.352 instead of 0.359 (TxGNN 0.121), and the specificity correction is not applied to the benchmark rankings. A proposed grading of the shown candidates into three levels did not replicate (the first two levels swapped order on the hard area subset, and the third did not reach the threshold) and was dropped. Two filters suggested by an AI agent acting as reviewer (see Use of AI), requiring the drug's target to touch the shared genes and excluding anti-infectives in non-infectious diseases, failed the criterion and were not applied. Whether at least 3 of the shared genes are specific (associated with fewer than 100 diseases) is displayed but not used as a filter: as a filter it failed the same criterion (the subset it would remove was right 9–11% of the time).</w:t>
+        <w:t xml:space="preserve">Of the 25 highest-ranked candidates that are not already approved for the disease, a candidate is shown only if it is indicated for an ontology-neighbour disease («direct extension») or for a disease sharing at least 3 associated genes with a hypergeometric p &lt; 10⁻⁵, the population being the genes with at least one associated disease (19,735) except the 55 associated with 500 or more diseases («shared genes»). These hub genes, mostly developmental genes of rare syndromes such as FGFR3, GLI3 and TP53, count neither in the number of shared genes nor in the test; the rule was pre-registered and adopted after the first version, because the candidates they alone brought were right 1–3% of the time, like hidden ones. Every other candidate is hidden. An earlier version also counted the diseases in that population, which made p-values too small; when this was corrected, the threshold was re-matched from 10⁻⁶ to 10⁻⁵ to keep the validated selection (97% agreement on the benchmark and areas; on the external exam 4.3% against 4.2% of candidates correct, with 4% fewer candidates), and all figures here use the corrected test. The acceptance criteria were fixed in advance: an evidence line had to separate correct from incorrect candidates on both the zero-shot benchmark (seeds 1–5) and the nine held-out disease areas, and a filter was applied only if the subset it removed had a hit rate below 5% in both. The rules themselves were revised in three rounds, each evaluated on both datasets, so the areas are not an untouched confirmation set. The external exam was used only as a confirmation set, together with the other splits, for two design decisions (the weight of the specificity correction and the removal of one data source, CTD), and never to choose an evidence rule. Neither decision moved the external result much: with CTD kept, as before the external set was consulted, OREVID's Recall@100 there was 0.352 instead of 0.359 in the model of version 2 (TxGNN 0.121), and the specificity correction is not applied to the benchmark rankings. A proposed grading of the shown candidates into three levels did not replicate (the first two levels swapped order on the hard area subset, and the third did not reach the threshold) and was dropped. Two filters suggested by an AI agent acting as reviewer (see Use of AI), requiring the drug's target to touch the shared genes and excluding anti-infectives in non-infectious diseases, failed the criterion and were not applied. Whether at least 3 of the shared genes are specific (associated with fewer than 100 diseases) is displayed but not used as a filter: as a filter it failed the same criterion (the subset it would remove was right 9–11% of the time).</w:t>
       </w:r>
     </w:p>
     <w:p>
@@ -306,6 +312,18 @@
       <w:pPr/>
       <w:r>
         <w:t xml:space="preserve">The external exam uses 3,718 drug–disease pairs in 645 diseases that are approved according to Open Targets 26.06 but absent from PrimeKG; models are trained on the first zero-shot split, and drugs already related to the disease in PrimeKG are not candidates. A pair is «non-obvious» when PrimeKG does not record the drug as indicated for any disease up to two ontology steps away (2,719 pairs in 563 diseases), and «recent» when its first trial is from 2018 or later (158 pairs in 99 diseases). Hit rates by evidence line are measured among the 25 highest-ranked candidates per disease, with specificity computed over each split's test diseases and without the website's exclusions. On the external exam they were also computed with the website's exact rules (specificity over 2,000 reference diseases of the training graph, and exclusion of other forms of an approved active moiety and of contraindicated, diagnostic and veterinary drugs; Open Targets approvals are not excluded here because they are the answer); both versions agree within their intervals (Supplementary Table S3).</w:t>
+      </w:r>
+    </w:p>
+    <w:p>
+      <w:pPr/>
+      <w:r>
+        <w:rPr>
+          <w:b/>
+        </w:rPr>
+        <w:t xml:space="preserve">Independent exams.</w:t>
+      </w:r>
+      <w:r>
+        <w:t xml:space="preserve"> Three further sets of drug–disease pairs, absent from PrimeKG and from the confirmed Open Targets approvals, were ranked by the production model trained on the whole graph, against the popularity baseline, with candidates restricted to drugs not indicated for the disease: biomarker-based sensitivity evidence of levels A–B for single drugs in CIViC [26] (cancers only); indications known only to DrugCentral [24] or MED-RT, the curated drug–disease relations of the US Veterans Health Administration; and European orphan designations (EMA), where every drug was a candidate because most designated drugs are not yet approved. A fourth test asked whether the candidates the website showed in the frozen snapshot of 12 October 2026 met their primary end point more often than the ranked drugs it did not show, among phase 2–3 trials with posted results on ClinicalTrials.gov. Each test and its decision rule were registered before the data were downloaded.</w:t>
       </w:r>
     </w:p>
     <w:p>
@@ -337,7 +355,7 @@
     <w:p>
       <w:pPr/>
       <w:r>
-        <w:t xml:space="preserve">OREVID uses Python 3.12.4, LightGBM 4.7.0, scikit-learn 1.9.1, NumPy 2.4.6, SciPy 1.18.0 and pandas 3.0.3. TxGNN ran in its own environment (Python 3.10, PyTorch 1.13.1 with CUDA 11.6, DGL 0.9.1). Training OREVID's predictor takes about 1 minute on a CPU and all OREVID evaluations about 35 minutes; TxGNN took about 95 minutes per split on one RTX 3060 GPU, about 22 hours for the 14 splits. AI assistance (Claude, Anthropic) was used to write and review code, to support the data analysis and for language editing; the reviews by AI agents and how their suggestions were checked are described under Use of AI in the Declarations. Figures 1–4 are drawn with matplotlib by the script evaluation/figures.py in the repository, which reads the result files (benchmark/predictions/*/results.json and docs/EVIDENCE_CI.md), so every plotted number comes from those files.</w:t>
+        <w:t xml:space="preserve">OREVID uses Python 3.12.4, LightGBM 4.7.0, scikit-learn 1.9.1, NumPy 2.4.6, SciPy 1.18.0 and pandas 3.0.3. TxGNN ran in its own environment (Python 3.10, PyTorch 1.13.1 with CUDA 11.6, DGL 0.9.1). Training OREVID's predictor takes about 1 minute on a CPU and all OREVID evaluations about 35 minutes; TxGNN took about 95 minutes per split on one RTX 3060 GPU, about 22 hours for the 14 splits, and about two hours for each of the two temporal cutoffs. AI assistance (Claude, Anthropic) was used to write and review code, to support the data analysis and for language editing; the reviews by AI agents and how their suggestions were checked are described under Use of AI in the Declarations. Figures 1–4 are drawn with matplotlib by the script evaluation/figures.py in the repository, which reads the result files (benchmark/predictions/*/results.json and docs/EVIDENCE_CI.md), so every plotted number comes from those files.</w:t>
       </w:r>
     </w:p>
     <w:p>
@@ -359,7 +377,7 @@
     <w:p>
       <w:pPr/>
       <w:r>
-        <w:t xml:space="preserve">OREVID recovered two to three times as many held-out treatments as TxGNN in every test (Figure 2, Table 1). Resampling whole diseases, the 95% interval of the paired difference in Recall@100 was +0.35 to +0.44 on zero-shot, +0.31 to +0.45 on the areas and +0.21 to +0.27 on the external exam; OREVID was ahead on 63% of zero-shot diseases and behind on 2%, the rest being ties (Supplementary Table S4). On the zero-shot split, Recall@100 was 0.811 ± 0.042 against 0.412 ± 0.042, and OREVID was ahead on each of the five seeds (paired differences 0.36–0.47; on the hard subset 0.539 ± 0.090 against 0.258 ± 0.067, differences 0.21–0.43). On the disease areas it was ahead in all nine (Figure 3, Table 2): 0.617 against 0.237 as a mean of areas, and 0.637 against 0.269 weighted by disease; on the hard area diseases TxGNN (0.141) did no better than the popularity baseline (0.141). Precision@K showed the same pattern (zero-shot 0.573 against 0.079; areas 0.408 against 0.057). AUPRC under TxGNN's protocol, which sets each correct drug against one sampled negative, was closer: 0.952 ± 0.009 against 0.910 ± 0.036 on zero-shot and 0.897 against 0.866 on the areas, and TxGNN had the higher AUPRC in five of the nine areas. TxGNN separates correct drugs from random ones almost as well; OREVID's advantage is in ranking them high among all 7,957 drugs. The popularity baseline, which ignores the disease, reached 0.358 ± 0.040 on zero-shot, slightly below TxGNN, and 0.130 on the external exam, slightly above it (0.121). Per disease, the difference between TxGNN and this baseline was not significant after Holm adjustment in any test except all area diseases (p = 0.047).</w:t>
+        <w:t xml:space="preserve">OREVID recovered two to three times as many held-out treatments as TxGNN in every test (Figure 2, Table 1). Resampling whole diseases, the 95% interval of the paired difference in Recall@100 was +0.35 to +0.44 on zero-shot, +0.33 to +0.46 on the areas and +0.20 to +0.27 on the external exam; OREVID was ahead on 63% of zero-shot diseases and behind on 3%, the rest being ties (Supplementary Table S4). On the zero-shot split, Recall@100 was 0.812 ± 0.038 against 0.412 ± 0.042, and OREVID was ahead on each of the five seeds (paired differences 0.36–0.47; on the hard subset 0.544 ± 0.077 against 0.258 ± 0.067, differences 0.22–0.43). On the disease areas it was ahead in all nine (Figure 3, Table 2): 0.627 against 0.237 as a mean of areas, and 0.645 against 0.269 weighted by disease; on the hard area diseases TxGNN (0.141) did no better than the popularity baseline (0.141). Precision@K showed the same pattern (zero-shot 0.580 against 0.079; areas 0.415 against 0.057). AUPRC under TxGNN's protocol, which sets each correct drug against one sampled negative, was closer: 0.952 ± 0.010 against 0.910 ± 0.036 on zero-shot and 0.898 against 0.866 on the areas, and TxGNN had the higher AUPRC in four of the nine areas. TxGNN separates correct drugs from random ones almost as well; OREVID's advantage is in ranking them high among all 7,957 drugs. The popularity baseline, which ignores the disease, reached 0.358 ± 0.040 on zero-shot, slightly below TxGNN, and 0.130 on the external exam, slightly above it (0.121). Per disease, the difference between TxGNN and this baseline was not significant after Holm adjustment in any test except all area diseases (p = 0.047).</w:t>
       </w:r>
     </w:p>
     <w:p>
@@ -407,13 +425,13 @@
         <w:t xml:space="preserve">Figure 2.</w:t>
       </w:r>
       <w:r>
-        <w:t xml:space="preserve"> Recall@100 of the popularity baseline, TxGNN and OREVID on four tests. Zero-shot: mean of five seeds; areas: mean of nine areas; external exam: first training split (over five splits, OREVID 0.367 ± 0.008, TxGNN 0.126 ± 0.004).</w:t>
+        <w:t xml:space="preserve"> Recall@100 of the popularity baseline, TxGNN and OREVID on four tests. Zero-shot: mean of five seeds; areas: mean of nine areas; external exam: first training split (over five splits, OREVID 0.366 ± 0.011, TxGNN 0.126 ± 0.004).</w:t>
       </w:r>
     </w:p>
     <w:p>
       <w:pPr/>
       <w:r>
-        <w:t xml:space="preserve">Two further comparisons show where the advantage comes from (Table 1). A logistic regression on the same metapath features without the popularity feature reached 0.781 ± 0.044 on zero-shot and 0.591 on the areas, and on the external exam it matched the full model (0.364 against 0.359; non-obvious pairs 0.193 against 0.178). It changes the learner as well as the feature, so it is not a single-factor ablation, but it shows that the gain over TxGNN does not depend on the popularity feature. Single metapaths alone were weaker (numbers refer to Supplementary Table S2): indication in an ontology neighbour (#6) reached 0.382 on zero-shot and 0.169 on the areas, in a disease up to two ontology steps away (#14) 0.461 and 0.254, and in a disease sharing associated genes (#22) 0.565 and 0.508; a drug whose target, enzyme or transporter is a disease gene (#2) reached 0.093 and 0.117, below the popularity baseline. On the 158 recent approvals (first trial in 2018 or later), Recall@100 was 0.355 for OREVID, 0.119 for TxGNN and 0.097 for the popularity baseline. Open Targets supplies part of the gene–disease features as well as the external labels, but removing every Open Targets feature (PrimeKG genes and targets plus STRING) changed Recall@100 little: 0.802 ± 0.048 on zero-shot, 0.628 on the areas and 0.348 on the external exam (0.351 with PrimeKG alone). A knowledge-graph embedding baseline, RotatE [7] (the best of TransE, ComplEx and RotatE in a pre-registered grid on zero-shot seed 1), reached 0.289 ± 0.058 on zero-shot, below the popularity baseline, 0.219 on the areas and 0.156 on the external exam, where it was above TxGNN (non-obvious approvals 0.127 against 0.085). An ensemble of OREVID and RotatE, chosen on two seeds, did not improve the confirmation tests (seeds 3–5 and the areas).</w:t>
+        <w:t xml:space="preserve">Two further comparisons show where the advantage comes from (Table 1). A logistic regression on the same metapath features without the popularity feature reached 0.782 ± 0.045 on zero-shot and 0.594 on the areas, and on the external exam it matched the full model (0.362 against 0.355; non-obvious pairs 0.191 against 0.175). It changes the learner as well as the feature, so it is not a single-factor ablation, but it shows that the gain over TxGNN does not depend on the popularity feature. Single metapaths alone were weaker (numbers refer to Supplementary Table S2): indication in an ontology neighbour (#6) reached 0.382 on zero-shot and 0.169 on the areas, in a disease up to two ontology steps away (#14) 0.461 and 0.254, and in a disease sharing associated genes (#22) 0.565 and 0.508; a drug whose target, enzyme or transporter is a disease gene (#2) reached 0.093 and 0.117, below the popularity baseline. On the 158 recent approvals (first trial in 2018 or later), Recall@100 was 0.344 for OREVID, 0.119 for TxGNN and 0.097 for the popularity baseline. Open Targets supplies part of the gene–disease features as well as the external labels, but removing every Open Targets feature (PrimeKG genes and targets plus STRING) changed Recall@100 little: 0.802 ± 0.048 on zero-shot, 0.628 on the areas and 0.348 on the external exam (0.351 with PrimeKG alone). A knowledge-graph embedding baseline, RotatE [7] (the best of TransE, ComplEx and RotatE in a pre-registered grid on zero-shot seed 1), reached 0.289 ± 0.058 on zero-shot, below the popularity baseline, 0.219 on the areas and 0.156 on the external exam, where it was above TxGNN (non-obvious approvals 0.127 against 0.085). An ensemble of OREVID and RotatE, chosen on two seeds, did not improve the confirmation tests (seeds 3–5 and the areas).</w:t>
       </w:r>
     </w:p>
     <w:p>
@@ -425,7 +443,7 @@
         <w:t xml:space="preserve">Table 1.</w:t>
       </w:r>
       <w:r>
-        <w:t xml:space="preserve"> Recall@100 by model and test. Zero-shot: mean ± SD over five seeds (335 diseases); areas: mean of nine areas (345 diseases); external exam: 645 diseases (non-obvious approvals: 2,719 pairs in 563 diseases; recent, first trial in 2018 or later: 158 pairs in 99 diseases). The logistic regression uses the same metapath features without the popularity feature. External exam: mean ± SD over models trained on each of the five zero-shot splits (TxGNN with its model for each split); the rest of the text, the hit rates and the examples use the first split (OREVID 0.359, TxGNN 0.121). The training-labels-only variant was not run on the external exam. RotatE: PyKEEN knowledge-graph embedding trained on each split's training edges, with its settings chosen on zero-shot seed 1; external exam on the first split only.</w:t>
+        <w:t xml:space="preserve"> Recall@100 by model and test. Zero-shot: mean ± SD over five seeds (335 diseases); areas: mean of nine areas (345 diseases); external exam: 645 diseases (non-obvious approvals: 2,719 pairs in 563 diseases; recent, first trial in 2018 or later: 158 pairs in 99 diseases). The logistic regression uses the same metapath features without the popularity feature. External exam: mean ± SD over models trained on each of the five zero-shot splits (TxGNN with its model for each split); the rest of the text, the hit rates and the examples use the first split (OREVID 0.355, TxGNN 0.121). The training-labels-only variant was not run on the external exam. RotatE: PyKEEN knowledge-graph embedding trained on each split's training edges, with its settings chosen on zero-shot seed 1; external exam on the first split only.</w:t>
       </w:r>
     </w:p>
     <w:tbl>
@@ -789,7 +807,7 @@
           <w:p>
             <w:pPr/>
             <w:r>
-              <w:t xml:space="preserve">0.811 ± 0.042</w:t>
+              <w:t xml:space="preserve">0.812 ± 0.038</w:t>
             </w:r>
           </w:p>
         </w:tc>
@@ -800,7 +818,7 @@
           <w:p>
             <w:pPr/>
             <w:r>
-              <w:t xml:space="preserve">0.539 ± 0.090</w:t>
+              <w:t xml:space="preserve">0.544 ± 0.077</w:t>
             </w:r>
           </w:p>
         </w:tc>
@@ -811,7 +829,7 @@
           <w:p>
             <w:pPr/>
             <w:r>
-              <w:t xml:space="preserve">0.617</w:t>
+              <w:t xml:space="preserve">0.627</w:t>
             </w:r>
           </w:p>
         </w:tc>
@@ -822,7 +840,7 @@
           <w:p>
             <w:pPr/>
             <w:r>
-              <w:t xml:space="preserve">0.367 ± 0.008</w:t>
+              <w:t xml:space="preserve">0.366 ± 0.011</w:t>
             </w:r>
           </w:p>
         </w:tc>
@@ -833,7 +851,7 @@
           <w:p>
             <w:pPr/>
             <w:r>
-              <w:t xml:space="preserve">0.184 ± 0.007</w:t>
+              <w:t xml:space="preserve">0.186 ± 0.009</w:t>
             </w:r>
           </w:p>
         </w:tc>
@@ -844,7 +862,7 @@
           <w:p>
             <w:pPr/>
             <w:r>
-              <w:t xml:space="preserve">0.365 ± 0.021</w:t>
+              <w:t xml:space="preserve">0.373 ± 0.018</w:t>
             </w:r>
           </w:p>
         </w:tc>
@@ -868,7 +886,7 @@
           <w:p>
             <w:pPr/>
             <w:r>
-              <w:t xml:space="preserve">0.803 ± 0.035</w:t>
+              <w:t xml:space="preserve">0.807 ± 0.037</w:t>
             </w:r>
           </w:p>
         </w:tc>
@@ -879,7 +897,7 @@
           <w:p>
             <w:pPr/>
             <w:r>
-              <w:t xml:space="preserve">0.530 ± 0.073</w:t>
+              <w:t xml:space="preserve">0.545 ± 0.075</w:t>
             </w:r>
           </w:p>
         </w:tc>
@@ -947,7 +965,7 @@
           <w:p>
             <w:pPr/>
             <w:r>
-              <w:t xml:space="preserve">0.781 ± 0.044</w:t>
+              <w:t xml:space="preserve">0.782 ± 0.045</w:t>
             </w:r>
           </w:p>
         </w:tc>
@@ -958,7 +976,7 @@
           <w:p>
             <w:pPr/>
             <w:r>
-              <w:t xml:space="preserve">0.501 ± 0.088</w:t>
+              <w:t xml:space="preserve">0.505 ± 0.090</w:t>
             </w:r>
           </w:p>
         </w:tc>
@@ -969,7 +987,7 @@
           <w:p>
             <w:pPr/>
             <w:r>
-              <w:t xml:space="preserve">0.591</w:t>
+              <w:t xml:space="preserve">0.594</w:t>
             </w:r>
           </w:p>
         </w:tc>
@@ -980,7 +998,7 @@
           <w:p>
             <w:pPr/>
             <w:r>
-              <w:t xml:space="preserve">0.363 ± 0.010</w:t>
+              <w:t xml:space="preserve">0.369 ± 0.010</w:t>
             </w:r>
           </w:p>
         </w:tc>
@@ -991,7 +1009,7 @@
           <w:p>
             <w:pPr/>
             <w:r>
-              <w:t xml:space="preserve">0.183 ± 0.013</w:t>
+              <w:t xml:space="preserve">0.190 ± 0.012</w:t>
             </w:r>
           </w:p>
         </w:tc>
@@ -1002,7 +1020,7 @@
           <w:p>
             <w:pPr/>
             <w:r>
-              <w:t xml:space="preserve">0.339 ± 0.016</w:t>
+              <w:t xml:space="preserve">0.337 ± 0.025</w:t>
             </w:r>
           </w:p>
         </w:tc>
@@ -1090,7 +1108,7 @@
     <w:p>
       <w:pPr/>
       <w:r>
-        <w:t xml:space="preserve">Removing the two protocol differences did not change the conclusion. Validation labels changed OREVID's Recall@100 by −0.005 to +0.027 depending on the subset (+0.008 on all zero-shot diseases, −0.002 on the areas). Excluding the few diseases where TxGNN gives every drug the same score (8 of 335 zero-shot, 3 of 345 in areas) raised both models slightly. With both differences removed, Recall@100 was 0.809 against 0.421 on zero-shot, 0.528 against 0.275 on its hard subset and 0.627 against 0.238 on the areas.</w:t>
+        <w:t xml:space="preserve">Removing the two protocol differences did not change the conclusion. Validation labels changed OREVID's Recall@100 by −0.001 to +0.019 depending on the subset (+0.005 on all zero-shot diseases, +0.008 on the areas). Excluding the few diseases where TxGNN gives every drug the same score (8 of 335 zero-shot, 3 of 345 in areas) raised both models slightly. With both differences removed, Recall@100 was 0.815 against 0.421 on zero-shot, 0.544 against 0.275 on its hard subset and 0.627 against 0.238 on the areas.</w:t>
       </w:r>
     </w:p>
     <w:p>
@@ -1308,7 +1326,7 @@
           <w:p>
             <w:pPr/>
             <w:r>
-              <w:t xml:space="preserve">0.995</w:t>
+              <w:t xml:space="preserve">0.994</w:t>
             </w:r>
           </w:p>
         </w:tc>
@@ -1398,7 +1416,7 @@
           <w:p>
             <w:pPr/>
             <w:r>
-              <w:t xml:space="preserve">0.968</w:t>
+              <w:t xml:space="preserve">0.966</w:t>
             </w:r>
           </w:p>
         </w:tc>
@@ -1444,7 +1462,7 @@
           <w:p>
             <w:pPr/>
             <w:r>
-              <w:t xml:space="preserve">0.726</w:t>
+              <w:t xml:space="preserve">0.733</w:t>
             </w:r>
           </w:p>
         </w:tc>
@@ -1488,7 +1506,7 @@
           <w:p>
             <w:pPr/>
             <w:r>
-              <w:t xml:space="preserve">0.909</w:t>
+              <w:t xml:space="preserve">0.910</w:t>
             </w:r>
           </w:p>
         </w:tc>
@@ -1624,7 +1642,7 @@
           <w:p>
             <w:pPr/>
             <w:r>
-              <w:t xml:space="preserve">0.737</w:t>
+              <w:t xml:space="preserve">0.736</w:t>
             </w:r>
           </w:p>
         </w:tc>
@@ -1646,7 +1664,7 @@
           <w:p>
             <w:pPr/>
             <w:r>
-              <w:t xml:space="preserve">0.576</w:t>
+              <w:t xml:space="preserve">0.574</w:t>
             </w:r>
           </w:p>
         </w:tc>
@@ -1668,7 +1686,7 @@
           <w:p>
             <w:pPr/>
             <w:r>
-              <w:t xml:space="preserve">0.949</w:t>
+              <w:t xml:space="preserve">0.951</w:t>
             </w:r>
           </w:p>
         </w:tc>
@@ -1758,7 +1776,7 @@
           <w:p>
             <w:pPr/>
             <w:r>
-              <w:t xml:space="preserve">0.727</w:t>
+              <w:t xml:space="preserve">0.739</w:t>
             </w:r>
           </w:p>
         </w:tc>
@@ -1804,7 +1822,7 @@
           <w:p>
             <w:pPr/>
             <w:r>
-              <w:t xml:space="preserve">0.427</w:t>
+              <w:t xml:space="preserve">0.457</w:t>
             </w:r>
           </w:p>
         </w:tc>
@@ -1826,7 +1844,7 @@
           <w:p>
             <w:pPr/>
             <w:r>
-              <w:t xml:space="preserve">0.349</w:t>
+              <w:t xml:space="preserve">0.384</w:t>
             </w:r>
           </w:p>
         </w:tc>
@@ -1848,7 +1866,7 @@
           <w:p>
             <w:pPr/>
             <w:r>
-              <w:t xml:space="preserve">0.871</w:t>
+              <w:t xml:space="preserve">0.870</w:t>
             </w:r>
           </w:p>
         </w:tc>
@@ -1894,7 +1912,7 @@
           <w:p>
             <w:pPr/>
             <w:r>
-              <w:t xml:space="preserve">0.582</w:t>
+              <w:t xml:space="preserve">0.641</w:t>
             </w:r>
           </w:p>
         </w:tc>
@@ -1916,7 +1934,7 @@
           <w:p>
             <w:pPr/>
             <w:r>
-              <w:t xml:space="preserve">0.409</w:t>
+              <w:t xml:space="preserve">0.496</w:t>
             </w:r>
           </w:p>
         </w:tc>
@@ -1938,7 +1956,7 @@
           <w:p>
             <w:pPr/>
             <w:r>
-              <w:t xml:space="preserve">0.915</w:t>
+              <w:t xml:space="preserve">0.917</w:t>
             </w:r>
           </w:p>
         </w:tc>
@@ -2028,7 +2046,7 @@
           <w:p>
             <w:pPr/>
             <w:r>
-              <w:t xml:space="preserve">0.952</w:t>
+              <w:t xml:space="preserve">0.950</w:t>
             </w:r>
           </w:p>
         </w:tc>
@@ -2074,7 +2092,7 @@
           <w:p>
             <w:pPr/>
             <w:r>
-              <w:t xml:space="preserve">0.617</w:t>
+              <w:t xml:space="preserve">0.627</w:t>
             </w:r>
           </w:p>
         </w:tc>
@@ -2096,7 +2114,7 @@
           <w:p>
             <w:pPr/>
             <w:r>
-              <w:t xml:space="preserve">0.490</w:t>
+              <w:t xml:space="preserve">0.504</w:t>
             </w:r>
           </w:p>
         </w:tc>
@@ -2118,7 +2136,7 @@
           <w:p>
             <w:pPr/>
             <w:r>
-              <w:t xml:space="preserve">0.897</w:t>
+              <w:t xml:space="preserve">0.898</w:t>
             </w:r>
           </w:p>
         </w:tc>
@@ -2164,7 +2182,7 @@
           <w:p>
             <w:pPr/>
             <w:r>
-              <w:t xml:space="preserve">0.637</w:t>
+              <w:t xml:space="preserve">0.645</w:t>
             </w:r>
           </w:p>
         </w:tc>
@@ -2186,7 +2204,7 @@
           <w:p>
             <w:pPr/>
             <w:r>
-              <w:t xml:space="preserve">0.479</w:t>
+              <w:t xml:space="preserve">0.491</w:t>
             </w:r>
           </w:p>
         </w:tc>
@@ -2273,7 +2291,7 @@
     <w:p>
       <w:pPr/>
       <w:r>
-        <w:t xml:space="preserve">In the zero-shot split, the advantage held when candidates were restricted to approved drugs (322 diseases; Recall@100 0.846 against 0.601) and when the 10% of drugs with most indications were removed (242 diseases; 0.742 against 0.289); the disease areas showed the same pattern (0.76 against 0.51, and 0.60 against 0.22). For correct drugs with no other indication, every model did poorly. Only 47 zero-shot diseases have such drugs: on them Recall@100 was 0.167 for OREVID and 0.144 for TxGNN, and Precision@K 0.003 and 0.028; on 127 area diseases, Recall@100 was 0.15 and 0.08. With so few diseases these comparisons are uncertain, and this is the regime where neither approach is useful.</w:t>
+        <w:t xml:space="preserve">In the zero-shot split, the advantage held when candidates were restricted to approved drugs (322 diseases; Recall@100 0.852 against 0.602) and when the 10% of drugs with most indications were removed (242 diseases; 0.743 against 0.288); the disease areas showed the same pattern (0.76 against 0.51, and 0.61 against 0.22). For correct drugs with no other indication, every model did poorly. Only 47 zero-shot diseases have such drugs: on them Recall@100 was 0.166 for OREVID and 0.147 for TxGNN, and Precision@K 0.003 and 0.028; on 127 area diseases, Recall@100 was 0.17 and 0.08. With so few diseases these comparisons are uncertain, and this is the regime where neither approach is useful.</w:t>
       </w:r>
     </w:p>
     <w:p>
@@ -2287,7 +2305,7 @@
     <w:p>
       <w:pPr/>
       <w:r>
-        <w:t xml:space="preserve">Among each disease's 25 highest-ranked candidates, the evidence lines separated correct from incorrect candidates in the same direction on the benchmark, on the area splits and on the external exam (Figure 4; numbers in Supplementary Table S3). A drug acting on a disease-associated gene, with no other line, was correct 1.8–3.4% of the time, no better than candidates with no evidence line at all (1.4–2.4%); shared genes with a disease that has many associated genes, where the overlap did not reach the significance threshold, were correct 0–2.5% of the time. When at least 3 shared genes were specific, shared-genes candidates were correct 31–34% of the time in hidden-treatment tests and 4.9% (95% CI 3.4–6.6%) in the external exam, against 10–11% and 3.0% otherwise.</w:t>
+        <w:t xml:space="preserve">Among each disease's 25 highest-ranked candidates, the evidence lines separated correct from incorrect candidates in the same direction on the benchmark, on the area splits and on the external exam (Figure 4; numbers in Supplementary Table S3). A drug acting on a disease-associated gene, with no other line, was correct 1.8–3.4% of the time, no better than candidates with no evidence line at all (1.4–2.4%); shared genes with a disease that has many associated genes, where the overlap did not reach the significance threshold, were correct 0–2.5% of the time. When at least 3 shared genes were specific, shared-genes candidates were correct 31–34% of the time in hidden-treatment tests and 4.8% (95% CI 3.4–6.5%) in the external exam, against 10–11% and 3.2% otherwise.</w:t>
       </w:r>
     </w:p>
     <w:p>
@@ -2347,13 +2365,13 @@
     <w:p>
       <w:pPr/>
       <w:r>
-        <w:t xml:space="preserve">The shared genes themselves, however, did not carry the signal. In the permutation test, random gene sets of the same size selected fewer candidates (1,996 on average, against 3,791) that were right 5.2% of the time on the external exam (99th percentile 5.6%), against 4.4% for the real shared genes, so the criterion fixed in advance was not met. In further, exploratory comparisons the same held within each range of gene-set size (fewer than 100 genes: 2.9% against a null of 2.5%; 100–499: 6.0% against 6.2%; 500 or more: 4.6% against 4.6%), when at least 3 specific genes were required (4.9% against 5.4%), and on the benchmark in every range of gene-set size (for diseases with fewer than 100 genes, 16.0% against a null of 11.9% and a 99th percentile of 18.0%). The threshold itself was not a sharp optimum: from 2 to 5 genes and p from 10⁻³ to 10⁻⁷, the external hit rate ranged from 3.9% to 4.8% (Supplementary Table S5). The line therefore selects drugs already used in diseases of similar size and research intensity; the genes it lists are context, not evidence of a shared mechanism. They are not unrelated to mechanism, however: in a pre-registered comparison with DrugMechDB [21], curated paths from drug to disease, the shared genes of 447 indicated drug–disease pairs contained a protein of the curated mechanism beyond the drug's direct targets in 25.1% of pairs, against 16.9% for as many genes drawn at random from the same disease (99th percentile 19.2%), although the sets are large (median 76 genes, of which a page shows 6).</w:t>
+        <w:t xml:space="preserve">The shared genes themselves, however, did not carry the signal. In the permutation test, random gene sets of the same size selected fewer candidates (2,008 on average, against 3,844) that were right 5.2% of the time on the external exam (99th percentile 5.7%), against 4.4% for the real shared genes, so the criterion fixed in advance was not met. In further, exploratory comparisons the same held within each range of gene-set size (fewer than 100 genes: 3.0% against a null of 2.5%; 100–499: 5.9% against 6.3%; 500 or more: 4.7% against 4.6%), when at least 3 specific genes were required (4.8% against 5.5%), and on the benchmark in every range of gene-set size (for diseases with fewer than 100 genes, 15.7% against a null of 10.9% and a 99th percentile of 16.9%). The threshold itself was not a sharp optimum: from 2 to 5 genes and p from 10⁻³ to 10⁻⁷, the external hit rate ranged from 4.1% to 4.8% (Supplementary Table S5). The line therefore selects drugs already used in diseases of similar size and research intensity; the genes it lists are context, not evidence of a shared mechanism. They are not unrelated to mechanism, however: in a pre-registered comparison with DrugMechDB [21], curated paths from drug to disease, the shared genes of 447 indicated drug–disease pairs contained a protein of the curated mechanism beyond the drug's direct targets in 25.1% of pairs, against 16.9% for as many genes drawn at random from the same disease (99th percentile 19.2%), although the sets are large (median 76 genes, of which a page shows 6).</w:t>
       </w:r>
     </w:p>
     <w:p>
       <w:pPr/>
       <w:r>
-        <w:t xml:space="preserve">Direct extensions are largely rediscovery. When the disease has no near-identical neighbour (hard subsets), their hit rate falls from 50–59% to 13–25%, close to the shared-genes line, and in the external exam it is 12.6%. The external exam, and especially its non-obvious pairs, is the fairer estimate of how these lines perform for new uses.</w:t>
+        <w:t xml:space="preserve">Direct extensions are largely rediscovery. When the disease has no near-identical neighbour (hard subsets), their hit rate falls from 50–59% to 14–25%, close to the shared-genes line, and in the external exam it is 12.6%. The external exam, and especially its non-obvious pairs, is the fairer estimate of how these lines perform for new uses.</w:t>
       </w:r>
     </w:p>
     <w:p>
@@ -2367,7 +2385,7 @@
     <w:p>
       <w:pPr/>
       <w:r>
-        <w:t xml:space="preserve">Rebuilt as known in 2015, OREVID ranked the uses that later reached phase 3 or approval above popularity, by less than first measured. In the first design (813 test diseases, 2,832 pairs) Recall@100 was 0.322 against 0.174 (paired difference 0.148, 95% CI 0.123–0.173), meeting the pre-registered rule, and the difference held for pairs with no PrimeKG drug–disease edge of any kind (0.117, 0.093–0.142) and for a model without any Open Targets feature (0.135). With every drug dated by its first approval (11% of PrimeKG indications undated instead of 80%), it was 0.286 against 0.181 (0.105, 0.081–0.128), so about a third of the first estimate came from later indications left in the training graph; the development cutoff (2012) agreed (0.114, 0.094–0.134). TxGNN, trained on exactly the same dated 2015 graph, reached 0.117, below popularity (OREVID − TxGNN 0.169, 0.145–0.194; at 2012 0.180, 0.157–0.203). On the dated test OREVID's advantage held for confirmed approvals (0.415 against 0.216 for popularity and 0.168 for TxGNN) but was small for non-obvious uses (0.024, 0.002–0.046); for drugs first approved after the cutoff, which had no use in the graph, 6.6% of their later uses were in OREVID's top 100, against 2.4% for TxGNN and 1.3% by chance. Among the 25 highest-ranked drugs per disease (first design), 5.4% of direct extensions, 3.1% of shared-genes candidates and 0.8% of hidden drugs later reached phase 3 or approval, the same ordering as in the external exam. A logistic model that turned section, rank and gene-set size into a calibrated probability improved the Brier score over the section rates by only 2.5% (pre-registered threshold 5%) and is not used.</w:t>
+        <w:t xml:space="preserve">Rebuilt as known in 2015, OREVID ranked the uses that later reached phase 3 or approval above popularity, by less than first measured. In the first design (813 test diseases, 2,832 pairs) Recall@100 was 0.322 against 0.174 (paired difference 0.148, 95% CI 0.123–0.174), meeting the pre-registered rule, and the difference held for pairs with no PrimeKG drug–disease edge of any kind (0.117, 0.092–0.142) and for a model without any Open Targets feature (0.135). With every drug dated by its first approval (11% of PrimeKG indications undated instead of 80%), it was 0.283 against 0.181 (0.102, 0.078–0.126), so about a third of the first estimate came from later indications left in the training graph; the development cutoff (2012) agreed (0.116, 0.096–0.136). TxGNN, trained on exactly the same dated 2015 graph, reached 0.117, below popularity (OREVID − TxGNN 0.167, 0.142–0.192; at 2012 0.182, 0.160–0.205); OREVID without any Open Targets feature, i.e. on the same data as TxGNN, reached 0.271 (0.155 above TxGNN). On the dated test OREVID's advantage held for confirmed approvals (0.428 against 0.216 for popularity and 0.168 for TxGNN) but was not shown for non-obvious uses (0.018, −0.004 to 0.040); for drugs first approved after the cutoff, which had no use in the graph, 8.6% of their later uses were in OREVID's top 100, against 2.4% for TxGNN and 1.3% by chance. Among the 25 highest-ranked drugs per disease, 5.0% of direct extensions, 2.5% of shared-genes candidates and 0.9% of hidden drugs later reached phase 3 or approval, the same ordering as in the external exam. A logistic model that turned section, rank and gene-set size into a calibrated probability improved the Brier score over the section rates by only 2.5% (pre-registered threshold 5%) and is not used.</w:t>
       </w:r>
     </w:p>
     <w:p>
@@ -2375,19 +2393,19 @@
         <w:pStyle w:val="Heading3"/>
       </w:pPr>
       <w:r>
-        <w:t xml:space="preserve">Examples</w:t>
+        <w:t xml:space="preserve">Independent exams</w:t>
       </w:r>
     </w:p>
     <w:p>
       <w:pPr/>
       <w:r>
-        <w:t xml:space="preserve">Three non-obvious approvals from the external exam were ranked in the top 25 with shared-genes evidence and no indication in an ontology neighbour. Sirolimus ranked first for tuberous sclerosis, through renal cell carcinoma, with which it shares five genes including TSC1 and TSC2 (p = 3.5 × 10⁻⁶). Aripiprazole ranked sixth for Tourette syndrome, through autism spectrum disorder (75 shared genes). Pasireotide ranked 12th for acromegaly, through Cushing syndrome (AIP, GNAS and POMC; p = 3.0 × 10⁻⁸).</w:t>
+        <w:t xml:space="preserve">On labels that no part of the graph contains, OREVID ranked the recorded uses above popularity in every exam. On 47 cancers with CIViC sensitivity evidence of levels A–B for a single drug (80 pairs), Recall@100 was 0.531 against 0.211 (paired difference 0.320, 95% CI 0.155–0.472); on the 28 pairs without any Open Targets clinical record the difference was 0.188 (−0.042 to 0.417). On 863 diseases with indications that only DrugCentral or MED-RT record (3,600 pairs) it was 0.390 against 0.125 (0.266, 0.238–0.295), with the same gain for each source alone (0.271 and 0.260). On 214 diseases with EMA orphan designations (592 pairs) it was 0.231 against 0.076 (0.155, 0.101–0.210), and on the 84 designations granted from 2023 on, after the graph's sources were built, 0.134 against 0.052 (0.082, 0.008–0.164).</w:t>
       </w:r>
     </w:p>
     <w:p>
       <w:pPr/>
       <w:r>
-        <w:t xml:space="preserve">The same evidence also fails in recognisable ways. Errors in gene–disease associations propagate: endocarditis carries genes associated with systemic lupus erythematosus in the source data, so antibiotics indicated for endocarditis (imipenem with cilastatin, cefapirin) are shown as candidates for lupus. Comorbidity reads as shared biology: rheumatoid arthritis shares immune genes with Graves disease, which brings the antithyroid drugs carbimazole and methimazole to the rheumatoid arthritis page. Broad-acting drugs recur despite the specificity correction: triamcinolone is shown on 1,218 of the 10,042 pages (12%), mostly rare syndromes whose genes overlap with those of diseases treated with corticosteroids. These cases are kept visible on the pages rather than filtered, and the website asks experts to flag them.</w:t>
+        <w:t xml:space="preserve">The website's evidence filter did not pick drugs that do better in trials. Among drug–disease pairs with a posted phase 2–3 result, 65.9% of the 126 shown candidates met their primary end point, against 81.3% of the 385 drugs ranked in the top 25 but not shown and 70.4% of the 297 ranked 26–100. Much of the gap comes from approved indications, whose successful trials sit in the second group; without them the difference between shown and not shown was −6.9 percentage points (−19.4 to +6.0), so the pre-registered claim was not supported. Posted results are a biased sample of trials, and the pairs are few.</w:t>
       </w:r>
     </w:p>
     <w:p>
@@ -2395,13 +2413,19 @@
         <w:pStyle w:val="Heading3"/>
       </w:pPr>
       <w:r>
-        <w:t xml:space="preserve">Data errors found</w:t>
+        <w:t xml:space="preserve">Examples</w:t>
       </w:r>
     </w:p>
     <w:p>
       <w:pPr/>
       <w:r>
-        <w:t xml:space="preserve">Open Targets 26.06 lists 10,215 approved drug–disease pairs that map to the graph. Some label or agency report supports 5,805 of them, but only 5,390 are supported by a report that names a single drug and spells out the disease. Two recurring errors explain part of the rest: substances mentioned in another drug's label (lincomycin marked as approved for multiple sclerosis from the fingolimod label) and abbreviations (the Japanese regulator's «ad» for attention-deficit disorder read as Alzheimer disease). Agreement with PrimeKG's indications, which come from DrugBank, was 25.7% for pairs supported by a label or agency (n = 5,805), 14.4% for pairs supported only by the Therapeutic Target Database (n = 1,599) and 4.2% for pairs supported only by ATC classes (n = 2,482). Both errors were reported to Open Targets.</w:t>
+        <w:t xml:space="preserve">Three non-obvious approvals from the external exam were ranked in the top 25 with shared-genes evidence and no indication in an ontology neighbour. Sirolimus ranked first for tuberous sclerosis, through renal cell carcinoma, with which it shares five genes including TSC1 and TSC2 (p = 3.5 × 10⁻⁶). Aripiprazole ranked seventh for Tourette syndrome, through autism spectrum disorder (75 shared genes). Pasireotide ranked 13th for acromegaly, through Cushing syndrome (AIP, GNAS and POMC; p = 3.0 × 10⁻⁸).</w:t>
+      </w:r>
+    </w:p>
+    <w:p>
+      <w:pPr/>
+      <w:r>
+        <w:t xml:space="preserve">The same evidence also fails in recognisable ways. Errors in gene–disease associations propagate: endocarditis carries genes associated with systemic lupus erythematosus in the source data, so antibiotics indicated for endocarditis (imipenem with cilastatin, cefapirin) are shown as candidates for lupus. Comorbidity reads as shared biology: rheumatoid arthritis shares immune genes with Graves disease, which brings the antithyroid drugs carbimazole and methimazole to the rheumatoid arthritis page. Broad-acting drugs recur despite the specificity correction: triamcinolone is shown on 731 of the 10,042 pages (7%), mostly rare syndromes whose genes overlap with those of diseases treated with corticosteroids. These cases are kept visible on the pages rather than filtered, and the website asks experts to flag them.</w:t>
       </w:r>
     </w:p>
     <w:p>
@@ -2409,13 +2433,27 @@
         <w:pStyle w:val="Heading3"/>
       </w:pPr>
       <w:r>
+        <w:t xml:space="preserve">Data errors found</w:t>
+      </w:r>
+    </w:p>
+    <w:p>
+      <w:pPr/>
+      <w:r>
+        <w:t xml:space="preserve">Open Targets 26.06 lists 10,215 approved drug–disease pairs that map to the graph. Some label or agency report supports 5,805 of them, but only 5,390 are supported by a report that names a single drug and spells out the disease. Two recurring errors explain part of the rest: substances mentioned in another drug's label (lincomycin marked as approved for multiple sclerosis from the fingolimod label) and abbreviations (the Japanese regulator's «ad» for attention-deficit disorder read as Alzheimer disease). Agreement with PrimeKG's indications, which come from DrugBank, was 25.7% for pairs supported by a label or agency (n = 5,805), 14.4% for pairs supported only by the Therapeutic Target Database (n = 1,599) and 4.2% for pairs supported only by ATC classes (n = 2,482). Both errors were reported to Open Targets.</w:t>
+      </w:r>
+    </w:p>
+    <w:p>
+      <w:pPr>
+        <w:pStyle w:val="Heading3"/>
+      </w:pPr>
+      <w:r>
         <w:t xml:space="preserve">Website</w:t>
       </w:r>
     </w:p>
     <w:p>
       <w:pPr/>
       <w:r>
-        <w:t xml:space="preserve">The website covers the 10,042 PrimeKG diseases with associated genes or phenotypes. A page shows, on average, 1.0 direct extension and 4.3 shared-genes candidates; 44% of diseases show neither (55% show no shared-genes candidate), mostly rare diseases with few associated genes, and the page says so instead of filling the list. Each candidate lists its evidence lines with the shared genes and p-values, the drug's targets and current indications, trials already run for the disease, and links for experts to send feedback, which will be used as new validation data. The exploratory list of drugs with no prior indication is shown separately and labelled as not validated. Pages link each disease to its broader term and its more specific forms, warn when the term is broad (at least 5 more specific forms or 500 associated genes), and mark direct extensions approved for a near-synonym of the disease. For information only, each candidate also shows whether a generic or biosimilar is marketed in the United States (FDA Orange Book and Purple Book) or authorised centrally in the European Union (EMA), and how many trials and articles already cover the pair; those with no trial and at most two articles are marked as underexplored.</w:t>
+        <w:t xml:space="preserve">The website covers the 10,042 PrimeKG diseases with associated genes or phenotypes. A page shows, on average, 1.0 direct extension and 4.4 shared-genes candidates; 44% of diseases show neither (55% show no shared-genes candidate), mostly rare diseases with few associated genes, and the page says so instead of filling the list. Each candidate lists its evidence lines with the shared genes and p-values, the drug's targets and current indications, trials already run for the disease, and links for experts to send feedback, which will be used as new validation data. The exploratory list of drugs with no prior indication is shown separately and labelled as not validated. Pages link each disease to its broader term and its more specific forms, warn when the term is broad (at least 5 more specific forms or 500 associated genes), and mark direct extensions approved for a near-synonym of the disease. For information only, each candidate also shows whether a generic or biosimilar is marketed in the United States (FDA Orange Book and Purple Book) or authorised centrally in the European Union (EMA), and how many trials and articles already cover the pair; those with no trial and at most two articles are marked as underexplored. Three further information lines were released only after a sample of 50 had at most two errors when read against the source: the Orphanet prevalence class of the disease (2,896 pages; only diseases that map to a single MONDO concept, because grouped nodes received a subtype's value in a first check with 3 errors in 50), the CPIC pharmacogenomic guidelines of the drug (73 drugs), and, for 392 drug–disease pairs on 145 pages, whether a colocalised QTL of the drug's target agrees with the drug's direction of action. The genetic line is shown only when the colocalisation is present in two Open Targets releases (26.06 and 26.09) and rests on a case–control GWAS of the page's own disease: lines without these conditions failed their checks (9 and 7 errors in 50), mostly because a QTL or GWAS trait seen in one release was not seen in the next or was mapped to a related disease.</w:t>
       </w:r>
     </w:p>
     <w:p>
@@ -2429,7 +2467,13 @@
     <w:p>
       <w:pPr/>
       <w:r>
-        <w:t xml:space="preserve">On identical data and splits, and on the ranking metrics used here, an interpretable metapath model with ranking-aware training recovered two to three times as many held-out treatments as TxGNN, and the gap persisted on whole disease areas, on approvals absent from the training graph and after removing the protocol differences between the two systems. It did not depend on drug popularity: a logistic regression without that feature did as well on the external exam. On AUPRC with sampled negatives the two systems were close, and TxGNN was better in five of nine areas, so the difference lies mainly in how high correct drugs rank against the whole drug list. Most of the signal comes from what already works in related diseases, and the strongest line, indication in an ontology neighbour, is largely rediscovery, as its fall on the hard subsets shows. Mechanistic evidence alone (the drug acts on a disease gene) carried no measurable signal at the top of the ranking, which argues for presenting such links as context rather than as support. Nor did the shared genes: random gene sets of the same size selected candidates that were right as often, so the second evidence line works as a selection of drugs already used in comparable diseases, not as evidence of a shared mechanism.</w:t>
+        <w:t xml:space="preserve">On identical data and splits, and on the ranking metrics used here, an interpretable metapath model with ranking-aware training recovered two to three times as many held-out treatments as TxGNN, and the gap persisted on whole disease areas, on approvals absent from the training graph and after removing the protocol differences between the two systems. It did not depend on drug popularity: a logistic regression without that feature did as well on the external exam. On AUPRC with sampled negatives the two systems were close, and TxGNN was better in four of nine areas, so the difference lies mainly in how high correct drugs rank against the whole drug list. Most of the signal comes from what already works in related diseases, and the strongest line, indication in an ontology neighbour, is largely rediscovery, as its fall on the hard subsets shows. Mechanistic evidence alone (the drug acts on a disease gene) carried no measurable signal at the top of the ranking, which argues for presenting such links as context rather than as support. Nor did the shared genes: random gene sets of the same size selected candidates that were right as often, so the second evidence line works as a selection of drugs already used in comparable diseases, not as evidence of a shared mechanism.</w:t>
+      </w:r>
+    </w:p>
+    <w:p>
+      <w:pPr/>
+      <w:r>
+        <w:t xml:space="preserve">Two tests added in this version bear on whether the advantage is more than rediscovery of known uses. Trained on the graph as known in 2015, with every drug dated by its first approval, TxGNN ranked the uses that later reached phase 3 or approval below popularity, while OREVID ranked them above it, and the gap did not come from the Open Targets features that only OREVID uses. On labels that no part of the graph contains (CIViC oncology evidence, indications that only DrugCentral or MED-RT record, and EMA orphan designations, including those granted from 2023 on), OREVID was ahead of popularity in every case. These are still recorded uses rather than prospective discoveries, and the gains on non-obvious uses remain small; the frozen prospective test is the one that can show discovery.</w:t>
       </w:r>
     </w:p>
     <w:p>
@@ -2453,7 +2497,7 @@
         <w:t xml:space="preserve">Limitations.</w:t>
       </w:r>
       <w:r>
-        <w:t xml:space="preserve"> All tests use recorded approvals as truth, which favours known treatments and penalises valid uses that were never approved. The external exam is out of sample but not prospective: most of those approvals predate PrimeKG and are simply missing from it. The temporal test removes later trials and associations from the graph; in its first design 80% of PrimeKG indications carried no date and stayed in the training graph, which inflated the advantage by about a third. Dating drugs by their first approval leaves 11% undated (indications added later to old drugs), so some later knowledge may still leak, and the advantage on non-obvious uses is small. The disease areas were used while designing both the model and the evidence rules, so they are not an untouched test set, and the threshold that defines the hard subset (half of the drugs already in a neighbour) was set by hand. Open Targets supplies gene–disease features as well as the external labels, although removing every Open Targets feature changed the external Recall@100 by only 0.011. Errors in the sources propagate, including wrong gene–disease associations and comorbidities that read as shared biology. Subtypes defined by a biomarker are not represented by that marker in the graph; a curated rule removes drugs acting on an absent marker for the listed subtypes (tamoxifen no longer appears for triple-negative breast cancer), but markers outside that list, and subtypes defined by mutations the graph does not encode, can still inherit treatments that cannot work. Broad terms with many associated genes (breast cancer has 1,253) pass the shared-genes test with almost any cancer; their shared-genes candidates were still right more often than hidden ones on the external exam (4.6% against 1.5%), so they are kept, but they may apply only to one subtype, which the pages now say. The risk warning relies on recorded contraindications, gives no signal when the drug has no label in related diseases, and cannot detect opposite mechanisms or class toxicities; the direction of effect of a new drug is not predicted. Drugs with no prior indication remain beyond the reach of every model tested; a pre-registered test of expression-signature reversal (LINCS L1000 consensus signatures against GEO disease signatures, 2,410 drugs and 239 diseases) ranked them at chance at the 2015 cutoff. Three pre-registered replacements for the shared-genes line (shared enriched Reactome pathways, specificity-weighted genes, genetic evidence only) did not beat the permutation null on the external exam either, although pathway overlap selected fewer candidates with a higher hit rate in every test (5.0% against 4.3% on the external exam). Network proximity between drug targets and disease genes [23] ranked drugs with no prior use above random at the 2015 cutoff (Recall@100 0.061 against 0.018) but below OREVID's own ranking of the same drugs (0.133), and as an added feature it did not pass its pre-registered rule. Restricting the shared genes to curated gene–disease validity (GenCC [22]) raised the external hit rate to 4.8% but removed correct candidates on the benchmark, and covers few diseases. An audit of drug status against current FDA and EMA labels is not yet shown on the website: its first version failed a manual check. Disease-area splits use one seed and approximate TxGNN's, which were drawn without a fixed seed. The reviews that led to some of the website's rules were done by AI agents, not by human experts (see Use of AI).</w:t>
+        <w:t xml:space="preserve"> All tests use recorded approvals as truth, which favours known treatments and penalises valid uses that were never approved. The external exam is out of sample but not prospective: most of those approvals predate PrimeKG and are simply missing from it. The temporal test removes later trials and associations from the graph; in its first design 80% of PrimeKG indications carried no date and stayed in the training graph, which inflated the advantage by about a third. Dating drugs by their first approval leaves 11% undated (indications added later to old drugs), so some later knowledge may still leak, and the advantage on non-obvious uses is not shown (0.018, −0.004 to 0.040). The disease areas were used while designing both the model and the evidence rules, so they are not an untouched test set, and the threshold that defines the hard subset (half of the drugs already in a neighbour) was set by hand. Open Targets supplies gene–disease features as well as the external labels, although removing every Open Targets feature changed the external Recall@100 by only 0.007. Errors in the sources propagate, including wrong gene–disease associations and comorbidities that read as shared biology. Subtypes defined by a biomarker are not represented by that marker in the graph; a curated rule removes drugs acting on an absent marker for the listed subtypes (tamoxifen no longer appears for triple-negative breast cancer), but markers outside that list, and subtypes defined by mutations the graph does not encode, can still inherit treatments that cannot work. Broad terms with many associated genes (breast cancer has 1,253) pass the shared-genes test with almost any cancer; their shared-genes candidates were still right more often than hidden ones on the external exam (4.7% against 1.5%), so they are kept, but they may apply only to one subtype, which the pages now say. The risk warning relies on recorded contraindications, gives no signal when the drug has no label in related diseases, and cannot detect opposite mechanisms or class toxicities; the direction of effect of a new drug is not predicted. Drugs with no prior indication remain beyond the reach of every model tested; a pre-registered test of expression-signature reversal (LINCS L1000 consensus signatures against GEO disease signatures, 2,410 drugs and 239 diseases) ranked them at chance at the 2015 cutoff. Three pre-registered replacements for the shared-genes line (shared enriched Reactome pathways, specificity-weighted genes, genetic evidence only) did not beat the permutation null on the external exam either, although pathway overlap selected fewer candidates with a higher hit rate in every test (5.0% against 4.3% on the external exam). Network proximity between drug targets and disease genes [23] ranked drugs with no prior use above random at the 2015 cutoff (Recall@100 0.061 against 0.018) but below OREVID's own ranking of the same drugs (0.133), and as an added feature it did not pass its pre-registered rule. Restricting the shared genes to curated gene–disease validity (GenCC [22]) raised the external hit rate to 4.8% but removed correct candidates on the benchmark, and covers few diseases. An audit of drug status against current FDA and EMA labels is not yet shown on the website: its first version failed a manual check. Disease-area splits use one seed and approximate TxGNN's, which were drawn without a fixed seed. The reviews that led to some of the website's rules were done by AI agents, not by human experts (see Use of AI). Two columns of the current model, the genetic direction and the Orphanet genes, entered by the author's decision after their pre-registered tests had not met the adoption rule: the direction changed Recall@100 by less than 0.001 overall because it applies to few test diseases (38 of 335 on the benchmark), and the Orphanet column improved the areas by 0.008 with an interval reaching −0.0004; neither harmed the ranking, both deviations are recorded in the repository, and with both the external exam moved from 0.359 to 0.355. The genetic direction rests on QTL colocalisations, which changed between two Open Targets releases for a fifth of the lines checked. Posted trial results did not favour the candidates the website shows (the shown pairs met their primary endpoint less often than top-25 drugs not shown; without approved indications −6.9 percentage points, −19.4 to +6.0), so the evidence filter is not shown to select drugs that do better in trials.</w:t>
       </w:r>
     </w:p>
     <w:p>
@@ -3007,6 +3051,30 @@
       </w:pPr>
       <w:r>
         <w:t xml:space="preserve">Avram S, Wilson TB, Curpan R, Halip L, Borota A, Bora A, et al. DrugCentral 2023 extends human clinical data and integrates veterinary drugs. Nucleic Acids Res. 2023;51(D1):D1276–D1287. doi:10.1093/nar/gkac1085</w:t>
+      </w:r>
+    </w:p>
+    <w:p>
+      <w:pPr>
+        <w:pStyle w:val="ListParagraph"/>
+        <w:numPr>
+          <w:ilvl w:val="0"/>
+          <w:numId w:val="2"/>
+        </w:numPr>
+      </w:pPr>
+      <w:r>
+        <w:t xml:space="preserve">Orphadata: free access data from Orphanet. © INSERM 1999. https://www.orphadata.com (products 6 and 9, downloaded 23–24 October 2026).</w:t>
+      </w:r>
+    </w:p>
+    <w:p>
+      <w:pPr>
+        <w:pStyle w:val="ListParagraph"/>
+        <w:numPr>
+          <w:ilvl w:val="0"/>
+          <w:numId w:val="2"/>
+        </w:numPr>
+      </w:pPr>
+      <w:r>
+        <w:t xml:space="preserve">Griffith M, Spies NC, Krysiak K, McMichael JF, Coffman AC, Danos AM, et al. CIViC is a community knowledgebase for expert crowdsourcing the clinical interpretation of variants in cancer. Nat Genet. 2017;49(2):170–174. doi:10.1038/ng.3774</w:t>
       </w:r>
     </w:p>
     <w:p>
@@ -3037,11 +3105,11 @@
         <w:tblLook w:val="04A0" w:firstRow="1" w:lastRow="0" w:firstColumn="0" w:lastColumn="0" w:noHBand="0" w:noVBand="1"/>
       </w:tblPr>
       <w:tblGrid>
-        <w:gridCol w:w="4410"/>
+        <w:gridCol w:w="3972"/>
         <w:gridCol w:w="1273"/>
         <w:gridCol w:w="1306"/>
-        <w:gridCol w:w="1027"/>
-        <w:gridCol w:w="1344"/>
+        <w:gridCol w:w="1345"/>
+        <w:gridCol w:w="1464"/>
       </w:tblGrid>
       <w:tr>
         <w:trPr>
@@ -3049,7 +3117,7 @@
         </w:trPr>
         <w:tc>
           <w:tcPr>
-            <w:tcW w:w="4410" w:type="dxa"/>
+            <w:tcW w:w="3972" w:type="dxa"/>
             <w:shd w:val="clear" w:color="auto" w:fill="F2F2F2"/>
           </w:tcPr>
           <w:p>
@@ -3085,7 +3153,7 @@
         </w:tc>
         <w:tc>
           <w:tcPr>
-            <w:tcW w:w="1027" w:type="dxa"/>
+            <w:tcW w:w="1345" w:type="dxa"/>
             <w:shd w:val="clear" w:color="auto" w:fill="F2F2F2"/>
           </w:tcPr>
           <w:p>
@@ -3097,7 +3165,7 @@
         </w:tc>
         <w:tc>
           <w:tcPr>
-            <w:tcW w:w="1344" w:type="dxa"/>
+            <w:tcW w:w="1464" w:type="dxa"/>
             <w:shd w:val="clear" w:color="auto" w:fill="F2F2F2"/>
           </w:tcPr>
           <w:p>
@@ -3111,7 +3179,7 @@
       <w:tr>
         <w:tc>
           <w:tcPr>
-            <w:tcW w:w="4410" w:type="dxa"/>
+            <w:tcW w:w="3972" w:type="dxa"/>
           </w:tcPr>
           <w:p>
             <w:pPr/>
@@ -3144,15 +3212,15 @@
         </w:tc>
         <w:tc>
           <w:tcPr>
-            <w:tcW w:w="1027" w:type="dxa"/>
-          </w:tcPr>
-          <w:p>
-            <w:pPr/>
-          </w:p>
-        </w:tc>
-        <w:tc>
-          <w:tcPr>
-            <w:tcW w:w="1344" w:type="dxa"/>
+            <w:tcW w:w="1345" w:type="dxa"/>
+          </w:tcPr>
+          <w:p>
+            <w:pPr/>
+          </w:p>
+        </w:tc>
+        <w:tc>
+          <w:tcPr>
+            <w:tcW w:w="1464" w:type="dxa"/>
           </w:tcPr>
           <w:p>
             <w:pPr/>
@@ -3165,7 +3233,7 @@
       <w:tr>
         <w:tc>
           <w:tcPr>
-            <w:tcW w:w="4410" w:type="dxa"/>
+            <w:tcW w:w="3972" w:type="dxa"/>
           </w:tcPr>
           <w:p>
             <w:pPr/>
@@ -3198,25 +3266,25 @@
         </w:tc>
         <w:tc>
           <w:tcPr>
-            <w:tcW w:w="1027" w:type="dxa"/>
-          </w:tcPr>
-          <w:p>
-            <w:pPr/>
-          </w:p>
-        </w:tc>
-        <w:tc>
-          <w:tcPr>
-            <w:tcW w:w="1344" w:type="dxa"/>
-          </w:tcPr>
-          <w:p>
-            <w:pPr/>
-          </w:p>
-        </w:tc>
-      </w:tr>
-      <w:tr>
-        <w:tc>
-          <w:tcPr>
-            <w:tcW w:w="4410" w:type="dxa"/>
+            <w:tcW w:w="1345" w:type="dxa"/>
+          </w:tcPr>
+          <w:p>
+            <w:pPr/>
+          </w:p>
+        </w:tc>
+        <w:tc>
+          <w:tcPr>
+            <w:tcW w:w="1464" w:type="dxa"/>
+          </w:tcPr>
+          <w:p>
+            <w:pPr/>
+          </w:p>
+        </w:tc>
+      </w:tr>
+      <w:tr>
+        <w:tc>
+          <w:tcPr>
+            <w:tcW w:w="3972" w:type="dxa"/>
           </w:tcPr>
           <w:p>
             <w:pPr/>
@@ -3246,7 +3314,7 @@
         </w:tc>
         <w:tc>
           <w:tcPr>
-            <w:tcW w:w="1027" w:type="dxa"/>
+            <w:tcW w:w="1345" w:type="dxa"/>
           </w:tcPr>
           <w:p>
             <w:pPr/>
@@ -3257,17 +3325,17 @@
         </w:tc>
         <w:tc>
           <w:tcPr>
-            <w:tcW w:w="1344" w:type="dxa"/>
-          </w:tcPr>
-          <w:p>
-            <w:pPr/>
-          </w:p>
-        </w:tc>
-      </w:tr>
-      <w:tr>
-        <w:tc>
-          <w:tcPr>
-            <w:tcW w:w="4410" w:type="dxa"/>
+            <w:tcW w:w="1464" w:type="dxa"/>
+          </w:tcPr>
+          <w:p>
+            <w:pPr/>
+          </w:p>
+        </w:tc>
+      </w:tr>
+      <w:tr>
+        <w:tc>
+          <w:tcPr>
+            <w:tcW w:w="3972" w:type="dxa"/>
           </w:tcPr>
           <w:p>
             <w:pPr/>
@@ -3300,25 +3368,25 @@
         </w:tc>
         <w:tc>
           <w:tcPr>
-            <w:tcW w:w="1027" w:type="dxa"/>
-          </w:tcPr>
-          <w:p>
-            <w:pPr/>
-          </w:p>
-        </w:tc>
-        <w:tc>
-          <w:tcPr>
-            <w:tcW w:w="1344" w:type="dxa"/>
-          </w:tcPr>
-          <w:p>
-            <w:pPr/>
-          </w:p>
-        </w:tc>
-      </w:tr>
-      <w:tr>
-        <w:tc>
-          <w:tcPr>
-            <w:tcW w:w="4410" w:type="dxa"/>
+            <w:tcW w:w="1345" w:type="dxa"/>
+          </w:tcPr>
+          <w:p>
+            <w:pPr/>
+          </w:p>
+        </w:tc>
+        <w:tc>
+          <w:tcPr>
+            <w:tcW w:w="1464" w:type="dxa"/>
+          </w:tcPr>
+          <w:p>
+            <w:pPr/>
+          </w:p>
+        </w:tc>
+      </w:tr>
+      <w:tr>
+        <w:tc>
+          <w:tcPr>
+            <w:tcW w:w="3972" w:type="dxa"/>
           </w:tcPr>
           <w:p>
             <w:pPr/>
@@ -3348,25 +3416,25 @@
         </w:tc>
         <w:tc>
           <w:tcPr>
-            <w:tcW w:w="1027" w:type="dxa"/>
-          </w:tcPr>
-          <w:p>
-            <w:pPr/>
-          </w:p>
-        </w:tc>
-        <w:tc>
-          <w:tcPr>
-            <w:tcW w:w="1344" w:type="dxa"/>
-          </w:tcPr>
-          <w:p>
-            <w:pPr/>
-          </w:p>
-        </w:tc>
-      </w:tr>
-      <w:tr>
-        <w:tc>
-          <w:tcPr>
-            <w:tcW w:w="4410" w:type="dxa"/>
+            <w:tcW w:w="1345" w:type="dxa"/>
+          </w:tcPr>
+          <w:p>
+            <w:pPr/>
+          </w:p>
+        </w:tc>
+        <w:tc>
+          <w:tcPr>
+            <w:tcW w:w="1464" w:type="dxa"/>
+          </w:tcPr>
+          <w:p>
+            <w:pPr/>
+          </w:p>
+        </w:tc>
+      </w:tr>
+      <w:tr>
+        <w:tc>
+          <w:tcPr>
+            <w:tcW w:w="3972" w:type="dxa"/>
           </w:tcPr>
           <w:p>
             <w:pPr/>
@@ -3396,25 +3464,25 @@
         </w:tc>
         <w:tc>
           <w:tcPr>
-            <w:tcW w:w="1027" w:type="dxa"/>
-          </w:tcPr>
-          <w:p>
-            <w:pPr/>
-          </w:p>
-        </w:tc>
-        <w:tc>
-          <w:tcPr>
-            <w:tcW w:w="1344" w:type="dxa"/>
-          </w:tcPr>
-          <w:p>
-            <w:pPr/>
-          </w:p>
-        </w:tc>
-      </w:tr>
-      <w:tr>
-        <w:tc>
-          <w:tcPr>
-            <w:tcW w:w="4410" w:type="dxa"/>
+            <w:tcW w:w="1345" w:type="dxa"/>
+          </w:tcPr>
+          <w:p>
+            <w:pPr/>
+          </w:p>
+        </w:tc>
+        <w:tc>
+          <w:tcPr>
+            <w:tcW w:w="1464" w:type="dxa"/>
+          </w:tcPr>
+          <w:p>
+            <w:pPr/>
+          </w:p>
+        </w:tc>
+      </w:tr>
+      <w:tr>
+        <w:tc>
+          <w:tcPr>
+            <w:tcW w:w="3972" w:type="dxa"/>
           </w:tcPr>
           <w:p>
             <w:pPr/>
@@ -3447,25 +3515,25 @@
         </w:tc>
         <w:tc>
           <w:tcPr>
-            <w:tcW w:w="1027" w:type="dxa"/>
-          </w:tcPr>
-          <w:p>
-            <w:pPr/>
-          </w:p>
-        </w:tc>
-        <w:tc>
-          <w:tcPr>
-            <w:tcW w:w="1344" w:type="dxa"/>
-          </w:tcPr>
-          <w:p>
-            <w:pPr/>
-          </w:p>
-        </w:tc>
-      </w:tr>
-      <w:tr>
-        <w:tc>
-          <w:tcPr>
-            <w:tcW w:w="4410" w:type="dxa"/>
+            <w:tcW w:w="1345" w:type="dxa"/>
+          </w:tcPr>
+          <w:p>
+            <w:pPr/>
+          </w:p>
+        </w:tc>
+        <w:tc>
+          <w:tcPr>
+            <w:tcW w:w="1464" w:type="dxa"/>
+          </w:tcPr>
+          <w:p>
+            <w:pPr/>
+          </w:p>
+        </w:tc>
+      </w:tr>
+      <w:tr>
+        <w:tc>
+          <w:tcPr>
+            <w:tcW w:w="3972" w:type="dxa"/>
           </w:tcPr>
           <w:p>
             <w:pPr/>
@@ -3495,7 +3563,7 @@
         </w:tc>
         <w:tc>
           <w:tcPr>
-            <w:tcW w:w="1027" w:type="dxa"/>
+            <w:tcW w:w="1345" w:type="dxa"/>
           </w:tcPr>
           <w:p>
             <w:pPr/>
@@ -3506,17 +3574,17 @@
         </w:tc>
         <w:tc>
           <w:tcPr>
-            <w:tcW w:w="1344" w:type="dxa"/>
-          </w:tcPr>
-          <w:p>
-            <w:pPr/>
-          </w:p>
-        </w:tc>
-      </w:tr>
-      <w:tr>
-        <w:tc>
-          <w:tcPr>
-            <w:tcW w:w="4410" w:type="dxa"/>
+            <w:tcW w:w="1464" w:type="dxa"/>
+          </w:tcPr>
+          <w:p>
+            <w:pPr/>
+          </w:p>
+        </w:tc>
+      </w:tr>
+      <w:tr>
+        <w:tc>
+          <w:tcPr>
+            <w:tcW w:w="3972" w:type="dxa"/>
           </w:tcPr>
           <w:p>
             <w:pPr/>
@@ -3549,7 +3617,7 @@
         </w:tc>
         <w:tc>
           <w:tcPr>
-            <w:tcW w:w="1027" w:type="dxa"/>
+            <w:tcW w:w="1345" w:type="dxa"/>
           </w:tcPr>
           <w:p>
             <w:pPr/>
@@ -3560,7 +3628,7 @@
         </w:tc>
         <w:tc>
           <w:tcPr>
-            <w:tcW w:w="1344" w:type="dxa"/>
+            <w:tcW w:w="1464" w:type="dxa"/>
           </w:tcPr>
           <w:p>
             <w:pPr/>
@@ -3573,7 +3641,7 @@
       <w:tr>
         <w:tc>
           <w:tcPr>
-            <w:tcW w:w="4410" w:type="dxa"/>
+            <w:tcW w:w="3972" w:type="dxa"/>
           </w:tcPr>
           <w:p>
             <w:pPr/>
@@ -3603,7 +3671,7 @@
         </w:tc>
         <w:tc>
           <w:tcPr>
-            <w:tcW w:w="1027" w:type="dxa"/>
+            <w:tcW w:w="1345" w:type="dxa"/>
           </w:tcPr>
           <w:p>
             <w:pPr/>
@@ -3614,17 +3682,17 @@
         </w:tc>
         <w:tc>
           <w:tcPr>
-            <w:tcW w:w="1344" w:type="dxa"/>
-          </w:tcPr>
-          <w:p>
-            <w:pPr/>
-          </w:p>
-        </w:tc>
-      </w:tr>
-      <w:tr>
-        <w:tc>
-          <w:tcPr>
-            <w:tcW w:w="4410" w:type="dxa"/>
+            <w:tcW w:w="1464" w:type="dxa"/>
+          </w:tcPr>
+          <w:p>
+            <w:pPr/>
+          </w:p>
+        </w:tc>
+      </w:tr>
+      <w:tr>
+        <w:tc>
+          <w:tcPr>
+            <w:tcW w:w="3972" w:type="dxa"/>
           </w:tcPr>
           <w:p>
             <w:pPr/>
@@ -3654,18 +3722,222 @@
         </w:tc>
         <w:tc>
           <w:tcPr>
-            <w:tcW w:w="1027" w:type="dxa"/>
-          </w:tcPr>
-          <w:p>
-            <w:pPr/>
-          </w:p>
-        </w:tc>
-        <w:tc>
-          <w:tcPr>
-            <w:tcW w:w="1344" w:type="dxa"/>
-          </w:tcPr>
-          <w:p>
-            <w:pPr/>
+            <w:tcW w:w="1345" w:type="dxa"/>
+          </w:tcPr>
+          <w:p>
+            <w:pPr/>
+          </w:p>
+        </w:tc>
+        <w:tc>
+          <w:tcPr>
+            <w:tcW w:w="1464" w:type="dxa"/>
+          </w:tcPr>
+          <w:p>
+            <w:pPr/>
+          </w:p>
+        </w:tc>
+      </w:tr>
+      <w:tr>
+        <w:tc>
+          <w:tcPr>
+            <w:tcW w:w="3972" w:type="dxa"/>
+          </w:tcPr>
+          <w:p>
+            <w:pPr/>
+            <w:r>
+              <w:t xml:space="preserve">QTL colocalisations (Open Targets 26.06; checked against 26.09)</w:t>
+            </w:r>
+          </w:p>
+        </w:tc>
+        <w:tc>
+          <w:tcPr>
+            <w:tcW w:w="1273" w:type="dxa"/>
+          </w:tcPr>
+          <w:p>
+            <w:pPr/>
+            <w:r>
+              <w:t xml:space="preserve">yes (genetic direction)</w:t>
+            </w:r>
+          </w:p>
+        </w:tc>
+        <w:tc>
+          <w:tcPr>
+            <w:tcW w:w="1306" w:type="dxa"/>
+          </w:tcPr>
+          <w:p>
+            <w:pPr/>
+          </w:p>
+        </w:tc>
+        <w:tc>
+          <w:tcPr>
+            <w:tcW w:w="1345" w:type="dxa"/>
+          </w:tcPr>
+          <w:p>
+            <w:pPr/>
+            <w:r>
+              <w:t xml:space="preserve">genetic line (verified lines only)</w:t>
+            </w:r>
+          </w:p>
+        </w:tc>
+        <w:tc>
+          <w:tcPr>
+            <w:tcW w:w="1464" w:type="dxa"/>
+          </w:tcPr>
+          <w:p>
+            <w:pPr/>
+          </w:p>
+        </w:tc>
+      </w:tr>
+      <w:tr>
+        <w:tc>
+          <w:tcPr>
+            <w:tcW w:w="3972" w:type="dxa"/>
+          </w:tcPr>
+          <w:p>
+            <w:pPr/>
+            <w:r>
+              <w:t xml:space="preserve">Orphanet genes and prevalence (Orphadata)</w:t>
+            </w:r>
+          </w:p>
+        </w:tc>
+        <w:tc>
+          <w:tcPr>
+            <w:tcW w:w="1273" w:type="dxa"/>
+          </w:tcPr>
+          <w:p>
+            <w:pPr/>
+            <w:r>
+              <w:t xml:space="preserve">yes (genes)</w:t>
+            </w:r>
+          </w:p>
+        </w:tc>
+        <w:tc>
+          <w:tcPr>
+            <w:tcW w:w="1306" w:type="dxa"/>
+          </w:tcPr>
+          <w:p>
+            <w:pPr/>
+          </w:p>
+        </w:tc>
+        <w:tc>
+          <w:tcPr>
+            <w:tcW w:w="1345" w:type="dxa"/>
+          </w:tcPr>
+          <w:p>
+            <w:pPr/>
+            <w:r>
+              <w:t xml:space="preserve">prevalence class</w:t>
+            </w:r>
+          </w:p>
+        </w:tc>
+        <w:tc>
+          <w:tcPr>
+            <w:tcW w:w="1464" w:type="dxa"/>
+          </w:tcPr>
+          <w:p>
+            <w:pPr/>
+          </w:p>
+        </w:tc>
+      </w:tr>
+      <w:tr>
+        <w:tc>
+          <w:tcPr>
+            <w:tcW w:w="3972" w:type="dxa"/>
+          </w:tcPr>
+          <w:p>
+            <w:pPr/>
+            <w:r>
+              <w:t xml:space="preserve">Pharmacogenomic guidelines (CPIC)</w:t>
+            </w:r>
+          </w:p>
+        </w:tc>
+        <w:tc>
+          <w:tcPr>
+            <w:tcW w:w="1273" w:type="dxa"/>
+          </w:tcPr>
+          <w:p>
+            <w:pPr/>
+            <w:r>
+              <w:t xml:space="preserve">no</w:t>
+            </w:r>
+          </w:p>
+        </w:tc>
+        <w:tc>
+          <w:tcPr>
+            <w:tcW w:w="1306" w:type="dxa"/>
+          </w:tcPr>
+          <w:p>
+            <w:pPr/>
+          </w:p>
+        </w:tc>
+        <w:tc>
+          <w:tcPr>
+            <w:tcW w:w="1345" w:type="dxa"/>
+          </w:tcPr>
+          <w:p>
+            <w:pPr/>
+            <w:r>
+              <w:t xml:space="preserve">yes</w:t>
+            </w:r>
+          </w:p>
+        </w:tc>
+        <w:tc>
+          <w:tcPr>
+            <w:tcW w:w="1464" w:type="dxa"/>
+          </w:tcPr>
+          <w:p>
+            <w:pPr/>
+          </w:p>
+        </w:tc>
+      </w:tr>
+      <w:tr>
+        <w:tc>
+          <w:tcPr>
+            <w:tcW w:w="3972" w:type="dxa"/>
+          </w:tcPr>
+          <w:p>
+            <w:pPr/>
+            <w:r>
+              <w:t xml:space="preserve">CIViC; DrugCentral and MED-RT indications; EMA orphan designations; ClinicalTrials.gov posted results</w:t>
+            </w:r>
+          </w:p>
+        </w:tc>
+        <w:tc>
+          <w:tcPr>
+            <w:tcW w:w="1273" w:type="dxa"/>
+          </w:tcPr>
+          <w:p>
+            <w:pPr/>
+            <w:r>
+              <w:t xml:space="preserve">no</w:t>
+            </w:r>
+          </w:p>
+        </w:tc>
+        <w:tc>
+          <w:tcPr>
+            <w:tcW w:w="1306" w:type="dxa"/>
+          </w:tcPr>
+          <w:p>
+            <w:pPr/>
+          </w:p>
+        </w:tc>
+        <w:tc>
+          <w:tcPr>
+            <w:tcW w:w="1345" w:type="dxa"/>
+          </w:tcPr>
+          <w:p>
+            <w:pPr/>
+          </w:p>
+        </w:tc>
+        <w:tc>
+          <w:tcPr>
+            <w:tcW w:w="1464" w:type="dxa"/>
+          </w:tcPr>
+          <w:p>
+            <w:pPr/>
+            <w:r>
+              <w:t xml:space="preserve">independent exams</w:t>
+            </w:r>
           </w:p>
         </w:tc>
       </w:tr>
@@ -3679,7 +3951,7 @@
         <w:t xml:space="preserve">Supplementary Table S2.</w:t>
       </w:r>
       <w:r>
-        <w:t xml:space="preserve"> The 22 metapath features. Gene sets: PrimeKG disease genes, extended in paths 20–22 with Open Targets associations (genetic association, genetic literature, somatic mutation, animal model, RNA expression). Targets: DrugBank targets (paths 1 and 3) or DrugBank targets, enzymes and transporters, plus ChEMBL mechanism targets in paths 20–21.</w:t>
+        <w:t xml:space="preserve"> The 22 metapath features and the two gene-level columns added in this version (23–24). Gene sets: PrimeKG disease genes, extended in paths 20–22 with Open Targets associations (genetic association, genetic literature, somatic mutation, animal model, RNA expression). Targets: DrugBank targets (paths 1 and 3) or DrugBank targets, enzymes and transporters, plus ChEMBL mechanism targets in paths 20–21.</w:t>
       </w:r>
     </w:p>
     <w:tbl>
@@ -4501,6 +4773,76 @@
             <w:pPr/>
             <w:r>
               <w:t xml:space="preserve">indicated for a disease with associated genes in common</w:t>
+            </w:r>
+          </w:p>
+        </w:tc>
+      </w:tr>
+      <w:tr>
+        <w:tc>
+          <w:tcPr>
+            <w:tcW w:w="755" w:type="dxa"/>
+          </w:tcPr>
+          <w:p>
+            <w:pPr/>
+            <w:r>
+              <w:t xml:space="preserve">23</w:t>
+            </w:r>
+          </w:p>
+        </w:tc>
+        <w:tc>
+          <w:tcPr>
+            <w:tcW w:w="3438" w:type="dxa"/>
+          </w:tcPr>
+          <w:p>
+            <w:pPr/>
+            <w:r>
+              <w:t xml:space="preserve">qtl direction</w:t>
+            </w:r>
+          </w:p>
+        </w:tc>
+        <w:tc>
+          <w:tcPr>
+            <w:tcW w:w="5165" w:type="dxa"/>
+          </w:tcPr>
+          <w:p>
+            <w:pPr/>
+            <w:r>
+              <w:t xml:space="preserve">targets whose colocalised QTL agrees with the drug's action minus those that oppose it (gene-level column; 0 when there is no colocalisation)</w:t>
+            </w:r>
+          </w:p>
+        </w:tc>
+      </w:tr>
+      <w:tr>
+        <w:tc>
+          <w:tcPr>
+            <w:tcW w:w="755" w:type="dxa"/>
+          </w:tcPr>
+          <w:p>
+            <w:pPr/>
+            <w:r>
+              <w:t xml:space="preserve">24</w:t>
+            </w:r>
+          </w:p>
+        </w:tc>
+        <w:tc>
+          <w:tcPr>
+            <w:tcW w:w="3438" w:type="dxa"/>
+          </w:tcPr>
+          <w:p>
+            <w:pPr/>
+            <w:r>
+              <w:t xml:space="preserve">orphanet genes</w:t>
+            </w:r>
+          </w:p>
+        </w:tc>
+        <w:tc>
+          <w:tcPr>
+            <w:tcW w:w="5165" w:type="dxa"/>
+          </w:tcPr>
+          <w:p>
+            <w:pPr/>
+            <w:r>
+              <w:t xml:space="preserve">log(1 + drug targets among the disease's Orphanet genes) (gene-level column; diseases that map to a single MONDO concept)</w:t>
             </w:r>
           </w:p>
         </w:tc>
@@ -4603,7 +4945,7 @@
           <w:p>
             <w:pPr/>
             <w:r>
-              <w:t xml:space="preserve">49.9 (42.2–57.8; 1,691)</w:t>
+              <w:t xml:space="preserve">50.0 (42.4–57.9; 1,701)</w:t>
             </w:r>
           </w:p>
         </w:tc>
@@ -4614,7 +4956,7 @@
           <w:p>
             <w:pPr/>
             <w:r>
-              <w:t xml:space="preserve">24.2 (18.3–30.1; 1,861)</w:t>
+              <w:t xml:space="preserve">24.3 (18.4–30.3; 1,834)</w:t>
             </w:r>
           </w:p>
         </w:tc>
@@ -4625,7 +4967,7 @@
           <w:p>
             <w:pPr/>
             <w:r>
-              <w:t xml:space="preserve">4.2 (2.9–5.8; 4,823)</w:t>
+              <w:t xml:space="preserve">4.2 (2.9–5.7; 4,840)</w:t>
             </w:r>
           </w:p>
         </w:tc>
@@ -4649,7 +4991,7 @@
           <w:p>
             <w:pPr/>
             <w:r>
-              <w:t xml:space="preserve">13.3 (7.0–20.6; 309)</w:t>
+              <w:t xml:space="preserve">14.1 (7.2–22.4; 313)</w:t>
             </w:r>
           </w:p>
         </w:tc>
@@ -4660,7 +5002,7 @@
           <w:p>
             <w:pPr/>
             <w:r>
-              <w:t xml:space="preserve">28.4 (19.2–38.1; 790)</w:t>
+              <w:t xml:space="preserve">28.6 (19.4–38.6; 776)</w:t>
             </w:r>
           </w:p>
         </w:tc>
@@ -4671,7 +5013,7 @@
           <w:p>
             <w:pPr/>
             <w:r>
-              <w:t xml:space="preserve">3.0 (1.9–4.1; 2,126)</w:t>
+              <w:t xml:space="preserve">3.0 (2.0–4.2; 2,136)</w:t>
             </w:r>
           </w:p>
         </w:tc>
@@ -4695,7 +5037,7 @@
           <w:p>
             <w:pPr/>
             <w:r>
-              <w:t xml:space="preserve">59.4 (48.5–69.4; 641)</w:t>
+              <w:t xml:space="preserve">59.4 (48.5–69.3; 646)</w:t>
             </w:r>
           </w:p>
         </w:tc>
@@ -4706,7 +5048,7 @@
           <w:p>
             <w:pPr/>
             <w:r>
-              <w:t xml:space="preserve">27.6 (22.8–32.4; 2,475)</w:t>
+              <w:t xml:space="preserve">27.7 (23.0–32.5; 2,483)</w:t>
             </w:r>
           </w:p>
         </w:tc>
@@ -4717,7 +5059,7 @@
           <w:p>
             <w:pPr/>
             <w:r>
-              <w:t xml:space="preserve">1.7 (1.2–2.4; 5,509)</w:t>
+              <w:t xml:space="preserve">1.7 (1.1–2.3; 5,496)</w:t>
             </w:r>
           </w:p>
         </w:tc>
@@ -4741,7 +5083,7 @@
           <w:p>
             <w:pPr/>
             <w:r>
-              <w:t xml:space="preserve">24.7 (11.5–39.2; 219)</w:t>
+              <w:t xml:space="preserve">25.0 (11.5–40.1; 220)</w:t>
             </w:r>
           </w:p>
         </w:tc>
@@ -4752,7 +5094,7 @@
           <w:p>
             <w:pPr/>
             <w:r>
-              <w:t xml:space="preserve">23.6 (18.6–28.9; 1,629)</w:t>
+              <w:t xml:space="preserve">23.8 (18.6–29.2; 1,641)</w:t>
             </w:r>
           </w:p>
         </w:tc>
@@ -4763,7 +5105,7 @@
           <w:p>
             <w:pPr/>
             <w:r>
-              <w:t xml:space="preserve">1.6 (1.0–2.3; 3,977)</w:t>
+              <w:t xml:space="preserve">1.5 (0.9–2.2; 3,964)</w:t>
             </w:r>
           </w:p>
         </w:tc>
@@ -4787,7 +5129,7 @@
           <w:p>
             <w:pPr/>
             <w:r>
-              <w:t xml:space="preserve">12.6 (9.8–15.6; 3,025)</w:t>
+              <w:t xml:space="preserve">12.6 (9.8–15.5; 3,027)</w:t>
             </w:r>
           </w:p>
         </w:tc>
@@ -4798,7 +5140,7 @@
           <w:p>
             <w:pPr/>
             <w:r>
-              <w:t xml:space="preserve">4.4 (3.2–5.8; 3,791)</w:t>
+              <w:t xml:space="preserve">4.4 (3.2–5.8; 3,844)</w:t>
             </w:r>
           </w:p>
         </w:tc>
@@ -4809,7 +5151,7 @@
           <w:p>
             <w:pPr/>
             <w:r>
-              <w:t xml:space="preserve">1.5 (1.1–1.9; 9,309)</w:t>
+              <w:t xml:space="preserve">1.5 (1.2–1.9; 9,254)</w:t>
             </w:r>
           </w:p>
         </w:tc>
@@ -4833,7 +5175,7 @@
           <w:p>
             <w:pPr/>
             <w:r>
-              <w:t xml:space="preserve">12.4 (9.7–15.5; 2,965)</w:t>
+              <w:t xml:space="preserve">12.4 (9.6–15.5; 2,954)</w:t>
             </w:r>
           </w:p>
         </w:tc>
@@ -4844,7 +5186,7 @@
           <w:p>
             <w:pPr/>
             <w:r>
-              <w:t xml:space="preserve">4.4 (3.2–5.9; 3,612)</w:t>
+              <w:t xml:space="preserve">4.2 (3.0–5.6; 3,671)</w:t>
             </w:r>
           </w:p>
         </w:tc>
@@ -4855,7 +5197,7 @@
           <w:p>
             <w:pPr/>
             <w:r>
-              <w:t xml:space="preserve">1.5 (1.1–1.9; 9,548)</w:t>
+              <w:t xml:space="preserve">1.4 (1.1–1.8; 9,500)</w:t>
             </w:r>
           </w:p>
         </w:tc>
@@ -5037,7 +5379,7 @@
           <w:p>
             <w:pPr/>
             <w:r>
-              <w:t xml:space="preserve">0.811 (0.772–0.847)</w:t>
+              <w:t xml:space="preserve">0.812 (0.774–0.848)</w:t>
             </w:r>
           </w:p>
         </w:tc>
@@ -5048,7 +5390,7 @@
           <w:p>
             <w:pPr/>
             <w:r>
-              <w:t xml:space="preserve">+0.399 (0.352–0.443)</w:t>
+              <w:t xml:space="preserve">+0.400 (0.354–0.444)</w:t>
             </w:r>
           </w:p>
         </w:tc>
@@ -5059,6 +5401,164 @@
           <w:p>
             <w:pPr/>
             <w:r>
+              <w:t xml:space="preserve">63% / 3%</w:t>
+            </w:r>
+          </w:p>
+        </w:tc>
+        <w:tc>
+          <w:tcPr>
+            <w:tcW w:w="1134" w:type="dxa"/>
+          </w:tcPr>
+          <w:p>
+            <w:pPr/>
+            <w:r>
+              <w:t xml:space="preserve">1 × 10⁻³³</w:t>
+            </w:r>
+          </w:p>
+        </w:tc>
+      </w:tr>
+      <w:tr>
+        <w:tc>
+          <w:tcPr>
+            <w:tcW w:w="1186" w:type="dxa"/>
+          </w:tcPr>
+          <w:p>
+            <w:pPr/>
+            <w:r>
+              <w:t xml:space="preserve">Zero-shot, hard</w:t>
+            </w:r>
+          </w:p>
+        </w:tc>
+        <w:tc>
+          <w:tcPr>
+            <w:tcW w:w="1492" w:type="dxa"/>
+          </w:tcPr>
+          <w:p>
+            <w:pPr/>
+            <w:r>
+              <w:t xml:space="preserve">0.203 (0.150–0.259)</w:t>
+            </w:r>
+          </w:p>
+        </w:tc>
+        <w:tc>
+          <w:tcPr>
+            <w:tcW w:w="1465" w:type="dxa"/>
+          </w:tcPr>
+          <w:p>
+            <w:pPr/>
+            <w:r>
+              <w:t xml:space="preserve">0.258 (0.197–0.324)</w:t>
+            </w:r>
+          </w:p>
+        </w:tc>
+        <w:tc>
+          <w:tcPr>
+            <w:tcW w:w="1475" w:type="dxa"/>
+          </w:tcPr>
+          <w:p>
+            <w:pPr/>
+            <w:r>
+              <w:t xml:space="preserve">0.544 (0.470–0.618)</w:t>
+            </w:r>
+          </w:p>
+        </w:tc>
+        <w:tc>
+          <w:tcPr>
+            <w:tcW w:w="1637" w:type="dxa"/>
+          </w:tcPr>
+          <w:p>
+            <w:pPr/>
+            <w:r>
+              <w:t xml:space="preserve">+0.286 (0.215–0.359)</w:t>
+            </w:r>
+          </w:p>
+        </w:tc>
+        <w:tc>
+          <w:tcPr>
+            <w:tcW w:w="969" w:type="dxa"/>
+          </w:tcPr>
+          <w:p>
+            <w:pPr/>
+            <w:r>
+              <w:t xml:space="preserve">50% / 6%</w:t>
+            </w:r>
+          </w:p>
+        </w:tc>
+        <w:tc>
+          <w:tcPr>
+            <w:tcW w:w="1134" w:type="dxa"/>
+          </w:tcPr>
+          <w:p>
+            <w:pPr/>
+            <w:r>
+              <w:t xml:space="preserve">2 × 10⁻⁹</w:t>
+            </w:r>
+          </w:p>
+        </w:tc>
+      </w:tr>
+      <w:tr>
+        <w:tc>
+          <w:tcPr>
+            <w:tcW w:w="1186" w:type="dxa"/>
+          </w:tcPr>
+          <w:p>
+            <w:pPr/>
+            <w:r>
+              <w:t xml:space="preserve">Areas</w:t>
+            </w:r>
+          </w:p>
+        </w:tc>
+        <w:tc>
+          <w:tcPr>
+            <w:tcW w:w="1492" w:type="dxa"/>
+          </w:tcPr>
+          <w:p>
+            <w:pPr/>
+            <w:r>
+              <w:t xml:space="preserve">0.185 (0.132–0.239)</w:t>
+            </w:r>
+          </w:p>
+        </w:tc>
+        <w:tc>
+          <w:tcPr>
+            <w:tcW w:w="1465" w:type="dxa"/>
+          </w:tcPr>
+          <w:p>
+            <w:pPr/>
+            <w:r>
+              <w:t xml:space="preserve">0.237 (0.181–0.295)</w:t>
+            </w:r>
+          </w:p>
+        </w:tc>
+        <w:tc>
+          <w:tcPr>
+            <w:tcW w:w="1475" w:type="dxa"/>
+          </w:tcPr>
+          <w:p>
+            <w:pPr/>
+            <w:r>
+              <w:t xml:space="preserve">0.627 (0.577–0.675)</w:t>
+            </w:r>
+          </w:p>
+        </w:tc>
+        <w:tc>
+          <w:tcPr>
+            <w:tcW w:w="1637" w:type="dxa"/>
+          </w:tcPr>
+          <w:p>
+            <w:pPr/>
+            <w:r>
+              <w:t xml:space="preserve">+0.390 (0.325–0.457)</w:t>
+            </w:r>
+          </w:p>
+        </w:tc>
+        <w:tc>
+          <w:tcPr>
+            <w:tcW w:w="969" w:type="dxa"/>
+          </w:tcPr>
+          <w:p>
+            <w:pPr/>
+            <w:r>
               <w:t xml:space="preserve">63% / 2%</w:t>
             </w:r>
           </w:p>
@@ -5070,7 +5570,7 @@
           <w:p>
             <w:pPr/>
             <w:r>
-              <w:t xml:space="preserve">2 × 10⁻³³</w:t>
+              <w:t xml:space="preserve">3 × 10⁻³⁶</w:t>
             </w:r>
           </w:p>
         </w:tc>
@@ -5083,7 +5583,7 @@
           <w:p>
             <w:pPr/>
             <w:r>
-              <w:t xml:space="preserve">Zero-shot, hard</w:t>
+              <w:t xml:space="preserve">Areas, hard</w:t>
             </w:r>
           </w:p>
         </w:tc>
@@ -5094,7 +5594,7 @@
           <w:p>
             <w:pPr/>
             <w:r>
-              <w:t xml:space="preserve">0.203 (0.150–0.259)</w:t>
+              <w:t xml:space="preserve">0.141 (0.078–0.213)</w:t>
             </w:r>
           </w:p>
         </w:tc>
@@ -5105,7 +5605,7 @@
           <w:p>
             <w:pPr/>
             <w:r>
-              <w:t xml:space="preserve">0.258 (0.197–0.324)</w:t>
+              <w:t xml:space="preserve">0.141 (0.086–0.204)</w:t>
             </w:r>
           </w:p>
         </w:tc>
@@ -5116,7 +5616,7 @@
           <w:p>
             <w:pPr/>
             <w:r>
-              <w:t xml:space="preserve">0.539 (0.465–0.613)</w:t>
+              <w:t xml:space="preserve">0.504 (0.428–0.578)</w:t>
             </w:r>
           </w:p>
         </w:tc>
@@ -5127,7 +5627,7 @@
           <w:p>
             <w:pPr/>
             <w:r>
-              <w:t xml:space="preserve">+0.281 (0.212–0.353)</w:t>
+              <w:t xml:space="preserve">+0.363 (0.280–0.444)</w:t>
             </w:r>
           </w:p>
         </w:tc>
@@ -5138,7 +5638,7 @@
           <w:p>
             <w:pPr/>
             <w:r>
-              <w:t xml:space="preserve">50% / 5%</w:t>
+              <w:t xml:space="preserve">56% / 3%</w:t>
             </w:r>
           </w:p>
         </w:tc>
@@ -5149,6 +5649,164 @@
           <w:p>
             <w:pPr/>
             <w:r>
+              <w:t xml:space="preserve">1 × 10⁻²¹</w:t>
+            </w:r>
+          </w:p>
+        </w:tc>
+      </w:tr>
+      <w:tr>
+        <w:tc>
+          <w:tcPr>
+            <w:tcW w:w="1186" w:type="dxa"/>
+          </w:tcPr>
+          <w:p>
+            <w:pPr/>
+            <w:r>
+              <w:t xml:space="preserve">External</w:t>
+            </w:r>
+          </w:p>
+        </w:tc>
+        <w:tc>
+          <w:tcPr>
+            <w:tcW w:w="1492" w:type="dxa"/>
+          </w:tcPr>
+          <w:p>
+            <w:pPr/>
+            <w:r>
+              <w:t xml:space="preserve">0.130 (0.109–0.152)</w:t>
+            </w:r>
+          </w:p>
+        </w:tc>
+        <w:tc>
+          <w:tcPr>
+            <w:tcW w:w="1465" w:type="dxa"/>
+          </w:tcPr>
+          <w:p>
+            <w:pPr/>
+            <w:r>
+              <w:t xml:space="preserve">0.121 (0.100–0.143)</w:t>
+            </w:r>
+          </w:p>
+        </w:tc>
+        <w:tc>
+          <w:tcPr>
+            <w:tcW w:w="1475" w:type="dxa"/>
+          </w:tcPr>
+          <w:p>
+            <w:pPr/>
+            <w:r>
+              <w:t xml:space="preserve">0.355 (0.324–0.386)</w:t>
+            </w:r>
+          </w:p>
+        </w:tc>
+        <w:tc>
+          <w:tcPr>
+            <w:tcW w:w="1637" w:type="dxa"/>
+          </w:tcPr>
+          <w:p>
+            <w:pPr/>
+            <w:r>
+              <w:t xml:space="preserve">+0.234 (0.202–0.266)</w:t>
+            </w:r>
+          </w:p>
+        </w:tc>
+        <w:tc>
+          <w:tcPr>
+            <w:tcW w:w="969" w:type="dxa"/>
+          </w:tcPr>
+          <w:p>
+            <w:pPr/>
+            <w:r>
+              <w:t xml:space="preserve">43% / 5%</w:t>
+            </w:r>
+          </w:p>
+        </w:tc>
+        <w:tc>
+          <w:tcPr>
+            <w:tcW w:w="1134" w:type="dxa"/>
+          </w:tcPr>
+          <w:p>
+            <w:pPr/>
+            <w:r>
+              <w:t xml:space="preserve">2 × 10⁻³⁴</w:t>
+            </w:r>
+          </w:p>
+        </w:tc>
+      </w:tr>
+      <w:tr>
+        <w:tc>
+          <w:tcPr>
+            <w:tcW w:w="1186" w:type="dxa"/>
+          </w:tcPr>
+          <w:p>
+            <w:pPr/>
+            <w:r>
+              <w:t xml:space="preserve">External, non-obvious</w:t>
+            </w:r>
+          </w:p>
+        </w:tc>
+        <w:tc>
+          <w:tcPr>
+            <w:tcW w:w="1492" w:type="dxa"/>
+          </w:tcPr>
+          <w:p>
+            <w:pPr/>
+            <w:r>
+              <w:t xml:space="preserve">0.075 (0.058–0.094)</w:t>
+            </w:r>
+          </w:p>
+        </w:tc>
+        <w:tc>
+          <w:tcPr>
+            <w:tcW w:w="1465" w:type="dxa"/>
+          </w:tcPr>
+          <w:p>
+            <w:pPr/>
+            <w:r>
+              <w:t xml:space="preserve">0.085 (0.066–0.105)</w:t>
+            </w:r>
+          </w:p>
+        </w:tc>
+        <w:tc>
+          <w:tcPr>
+            <w:tcW w:w="1475" w:type="dxa"/>
+          </w:tcPr>
+          <w:p>
+            <w:pPr/>
+            <w:r>
+              <w:t xml:space="preserve">0.175 (0.149–0.203)</w:t>
+            </w:r>
+          </w:p>
+        </w:tc>
+        <w:tc>
+          <w:tcPr>
+            <w:tcW w:w="1637" w:type="dxa"/>
+          </w:tcPr>
+          <w:p>
+            <w:pPr/>
+            <w:r>
+              <w:t xml:space="preserve">+0.090 (0.062–0.120)</w:t>
+            </w:r>
+          </w:p>
+        </w:tc>
+        <w:tc>
+          <w:tcPr>
+            <w:tcW w:w="969" w:type="dxa"/>
+          </w:tcPr>
+          <w:p>
+            <w:pPr/>
+            <w:r>
+              <w:t xml:space="preserve">24% / 9%</w:t>
+            </w:r>
+          </w:p>
+        </w:tc>
+        <w:tc>
+          <w:tcPr>
+            <w:tcW w:w="1134" w:type="dxa"/>
+          </w:tcPr>
+          <w:p>
+            <w:pPr/>
+            <w:r>
               <w:t xml:space="preserve">2 × 10⁻⁹</w:t>
             </w:r>
           </w:p>
@@ -5162,7 +5820,7 @@
           <w:p>
             <w:pPr/>
             <w:r>
-              <w:t xml:space="preserve">Areas</w:t>
+              <w:t xml:space="preserve">External, recent</w:t>
             </w:r>
           </w:p>
         </w:tc>
@@ -5173,7 +5831,7 @@
           <w:p>
             <w:pPr/>
             <w:r>
-              <w:t xml:space="preserve">0.185 (0.132–0.239)</w:t>
+              <w:t xml:space="preserve">0.097 (0.045–0.154)</w:t>
             </w:r>
           </w:p>
         </w:tc>
@@ -5184,7 +5842,7 @@
           <w:p>
             <w:pPr/>
             <w:r>
-              <w:t xml:space="preserve">0.237 (0.181–0.295)</w:t>
+              <w:t xml:space="preserve">0.119 (0.061–0.184)</w:t>
             </w:r>
           </w:p>
         </w:tc>
@@ -5195,7 +5853,7 @@
           <w:p>
             <w:pPr/>
             <w:r>
-              <w:t xml:space="preserve">0.617 (0.566–0.665)</w:t>
+              <w:t xml:space="preserve">0.344 (0.255–0.437)</w:t>
             </w:r>
           </w:p>
         </w:tc>
@@ -5206,7 +5864,7 @@
           <w:p>
             <w:pPr/>
             <w:r>
-              <w:t xml:space="preserve">+0.380 (0.314–0.447)</w:t>
+              <w:t xml:space="preserve">+0.226 (0.132–0.322)</w:t>
             </w:r>
           </w:p>
         </w:tc>
@@ -5217,7 +5875,7 @@
           <w:p>
             <w:pPr/>
             <w:r>
-              <w:t xml:space="preserve">63% / 3%</w:t>
+              <w:t xml:space="preserve">29% / 4%</w:t>
             </w:r>
           </w:p>
         </w:tc>
@@ -5228,323 +5886,7 @@
           <w:p>
             <w:pPr/>
             <w:r>
-              <w:t xml:space="preserve">2 × 10⁻³⁵</w:t>
-            </w:r>
-          </w:p>
-        </w:tc>
-      </w:tr>
-      <w:tr>
-        <w:tc>
-          <w:tcPr>
-            <w:tcW w:w="1186" w:type="dxa"/>
-          </w:tcPr>
-          <w:p>
-            <w:pPr/>
-            <w:r>
-              <w:t xml:space="preserve">Areas, hard</w:t>
-            </w:r>
-          </w:p>
-        </w:tc>
-        <w:tc>
-          <w:tcPr>
-            <w:tcW w:w="1492" w:type="dxa"/>
-          </w:tcPr>
-          <w:p>
-            <w:pPr/>
-            <w:r>
-              <w:t xml:space="preserve">0.141 (0.078–0.213)</w:t>
-            </w:r>
-          </w:p>
-        </w:tc>
-        <w:tc>
-          <w:tcPr>
-            <w:tcW w:w="1465" w:type="dxa"/>
-          </w:tcPr>
-          <w:p>
-            <w:pPr/>
-            <w:r>
-              <w:t xml:space="preserve">0.141 (0.086–0.204)</w:t>
-            </w:r>
-          </w:p>
-        </w:tc>
-        <w:tc>
-          <w:tcPr>
-            <w:tcW w:w="1475" w:type="dxa"/>
-          </w:tcPr>
-          <w:p>
-            <w:pPr/>
-            <w:r>
-              <w:t xml:space="preserve">0.490 (0.414–0.565)</w:t>
-            </w:r>
-          </w:p>
-        </w:tc>
-        <w:tc>
-          <w:tcPr>
-            <w:tcW w:w="1637" w:type="dxa"/>
-          </w:tcPr>
-          <w:p>
-            <w:pPr/>
-            <w:r>
-              <w:t xml:space="preserve">+0.349 (0.268–0.431)</w:t>
-            </w:r>
-          </w:p>
-        </w:tc>
-        <w:tc>
-          <w:tcPr>
-            <w:tcW w:w="969" w:type="dxa"/>
-          </w:tcPr>
-          <w:p>
-            <w:pPr/>
-            <w:r>
-              <w:t xml:space="preserve">56% / 4%</w:t>
-            </w:r>
-          </w:p>
-        </w:tc>
-        <w:tc>
-          <w:tcPr>
-            <w:tcW w:w="1134" w:type="dxa"/>
-          </w:tcPr>
-          <w:p>
-            <w:pPr/>
-            <w:r>
-              <w:t xml:space="preserve">6 × 10⁻²¹</w:t>
-            </w:r>
-          </w:p>
-        </w:tc>
-      </w:tr>
-      <w:tr>
-        <w:tc>
-          <w:tcPr>
-            <w:tcW w:w="1186" w:type="dxa"/>
-          </w:tcPr>
-          <w:p>
-            <w:pPr/>
-            <w:r>
-              <w:t xml:space="preserve">External</w:t>
-            </w:r>
-          </w:p>
-        </w:tc>
-        <w:tc>
-          <w:tcPr>
-            <w:tcW w:w="1492" w:type="dxa"/>
-          </w:tcPr>
-          <w:p>
-            <w:pPr/>
-            <w:r>
-              <w:t xml:space="preserve">0.130 (0.109–0.152)</w:t>
-            </w:r>
-          </w:p>
-        </w:tc>
-        <w:tc>
-          <w:tcPr>
-            <w:tcW w:w="1465" w:type="dxa"/>
-          </w:tcPr>
-          <w:p>
-            <w:pPr/>
-            <w:r>
-              <w:t xml:space="preserve">0.121 (0.100–0.143)</w:t>
-            </w:r>
-          </w:p>
-        </w:tc>
-        <w:tc>
-          <w:tcPr>
-            <w:tcW w:w="1475" w:type="dxa"/>
-          </w:tcPr>
-          <w:p>
-            <w:pPr/>
-            <w:r>
-              <w:t xml:space="preserve">0.359 (0.327–0.390)</w:t>
-            </w:r>
-          </w:p>
-        </w:tc>
-        <w:tc>
-          <w:tcPr>
-            <w:tcW w:w="1637" w:type="dxa"/>
-          </w:tcPr>
-          <w:p>
-            <w:pPr/>
-            <w:r>
-              <w:t xml:space="preserve">+0.238 (0.206–0.270)</w:t>
-            </w:r>
-          </w:p>
-        </w:tc>
-        <w:tc>
-          <w:tcPr>
-            <w:tcW w:w="969" w:type="dxa"/>
-          </w:tcPr>
-          <w:p>
-            <w:pPr/>
-            <w:r>
-              <w:t xml:space="preserve">43% / 5%</w:t>
-            </w:r>
-          </w:p>
-        </w:tc>
-        <w:tc>
-          <w:tcPr>
-            <w:tcW w:w="1134" w:type="dxa"/>
-          </w:tcPr>
-          <w:p>
-            <w:pPr/>
-            <w:r>
-              <w:t xml:space="preserve">1 × 10⁻³⁴</w:t>
-            </w:r>
-          </w:p>
-        </w:tc>
-      </w:tr>
-      <w:tr>
-        <w:tc>
-          <w:tcPr>
-            <w:tcW w:w="1186" w:type="dxa"/>
-          </w:tcPr>
-          <w:p>
-            <w:pPr/>
-            <w:r>
-              <w:t xml:space="preserve">External, non-obvious</w:t>
-            </w:r>
-          </w:p>
-        </w:tc>
-        <w:tc>
-          <w:tcPr>
-            <w:tcW w:w="1492" w:type="dxa"/>
-          </w:tcPr>
-          <w:p>
-            <w:pPr/>
-            <w:r>
-              <w:t xml:space="preserve">0.075 (0.058–0.094)</w:t>
-            </w:r>
-          </w:p>
-        </w:tc>
-        <w:tc>
-          <w:tcPr>
-            <w:tcW w:w="1465" w:type="dxa"/>
-          </w:tcPr>
-          <w:p>
-            <w:pPr/>
-            <w:r>
-              <w:t xml:space="preserve">0.085 (0.066–0.105)</w:t>
-            </w:r>
-          </w:p>
-        </w:tc>
-        <w:tc>
-          <w:tcPr>
-            <w:tcW w:w="1475" w:type="dxa"/>
-          </w:tcPr>
-          <w:p>
-            <w:pPr/>
-            <w:r>
-              <w:t xml:space="preserve">0.178 (0.152–0.206)</w:t>
-            </w:r>
-          </w:p>
-        </w:tc>
-        <w:tc>
-          <w:tcPr>
-            <w:tcW w:w="1637" w:type="dxa"/>
-          </w:tcPr>
-          <w:p>
-            <w:pPr/>
-            <w:r>
-              <w:t xml:space="preserve">+0.094 (0.064–0.123)</w:t>
-            </w:r>
-          </w:p>
-        </w:tc>
-        <w:tc>
-          <w:tcPr>
-            <w:tcW w:w="969" w:type="dxa"/>
-          </w:tcPr>
-          <w:p>
-            <w:pPr/>
-            <w:r>
-              <w:t xml:space="preserve">24% / 9%</w:t>
-            </w:r>
-          </w:p>
-        </w:tc>
-        <w:tc>
-          <w:tcPr>
-            <w:tcW w:w="1134" w:type="dxa"/>
-          </w:tcPr>
-          <w:p>
-            <w:pPr/>
-            <w:r>
-              <w:t xml:space="preserve">2 × 10⁻⁹</w:t>
-            </w:r>
-          </w:p>
-        </w:tc>
-      </w:tr>
-      <w:tr>
-        <w:tc>
-          <w:tcPr>
-            <w:tcW w:w="1186" w:type="dxa"/>
-          </w:tcPr>
-          <w:p>
-            <w:pPr/>
-            <w:r>
-              <w:t xml:space="preserve">External, recent</w:t>
-            </w:r>
-          </w:p>
-        </w:tc>
-        <w:tc>
-          <w:tcPr>
-            <w:tcW w:w="1492" w:type="dxa"/>
-          </w:tcPr>
-          <w:p>
-            <w:pPr/>
-            <w:r>
-              <w:t xml:space="preserve">0.097 (0.045–0.154)</w:t>
-            </w:r>
-          </w:p>
-        </w:tc>
-        <w:tc>
-          <w:tcPr>
-            <w:tcW w:w="1465" w:type="dxa"/>
-          </w:tcPr>
-          <w:p>
-            <w:pPr/>
-            <w:r>
-              <w:t xml:space="preserve">0.119 (0.061–0.184)</w:t>
-            </w:r>
-          </w:p>
-        </w:tc>
-        <w:tc>
-          <w:tcPr>
-            <w:tcW w:w="1475" w:type="dxa"/>
-          </w:tcPr>
-          <w:p>
-            <w:pPr/>
-            <w:r>
-              <w:t xml:space="preserve">0.355 (0.266–0.448)</w:t>
-            </w:r>
-          </w:p>
-        </w:tc>
-        <w:tc>
-          <w:tcPr>
-            <w:tcW w:w="1637" w:type="dxa"/>
-          </w:tcPr>
-          <w:p>
-            <w:pPr/>
-            <w:r>
-              <w:t xml:space="preserve">+0.236 (0.141–0.332)</w:t>
-            </w:r>
-          </w:p>
-        </w:tc>
-        <w:tc>
-          <w:tcPr>
-            <w:tcW w:w="969" w:type="dxa"/>
-          </w:tcPr>
-          <w:p>
-            <w:pPr/>
-            <w:r>
-              <w:t xml:space="preserve">30% / 4%</w:t>
-            </w:r>
-          </w:p>
-        </w:tc>
-        <w:tc>
-          <w:tcPr>
-            <w:tcW w:w="1134" w:type="dxa"/>
-          </w:tcPr>
-          <w:p>
-            <w:pPr/>
-            <w:r>
-              <w:t xml:space="preserve">2 × 10⁻⁴</w:t>
+              <w:t xml:space="preserve">3 × 10⁻⁴</w:t>
             </w:r>
           </w:p>
         </w:tc>
@@ -5647,7 +5989,7 @@
           <w:p>
             <w:pPr/>
             <w:r>
-              <w:t xml:space="preserve">21.4 (16.4–26.7; 2,202)</w:t>
+              <w:t xml:space="preserve">21.4 (16.3–26.6; 2,194)</w:t>
             </w:r>
           </w:p>
         </w:tc>
@@ -5658,7 +6000,7 @@
           <w:p>
             <w:pPr/>
             <w:r>
-              <w:t xml:space="preserve">23.5 (19.4–27.7; 3,013)</w:t>
+              <w:t xml:space="preserve">23.7 (19.5–27.9; 3,031)</w:t>
             </w:r>
           </w:p>
         </w:tc>
@@ -5669,7 +6011,7 @@
           <w:p>
             <w:pPr/>
             <w:r>
-              <w:t xml:space="preserve">3.9 (3.0–5.1; 4,685)</w:t>
+              <w:t xml:space="preserve">4.1 (3.1–5.2; 4,751)</w:t>
             </w:r>
           </w:p>
         </w:tc>
@@ -5693,7 +6035,7 @@
           <w:p>
             <w:pPr/>
             <w:r>
-              <w:t xml:space="preserve">24.3 (18.7–30.1; 1,926)</w:t>
+              <w:t xml:space="preserve">24.4 (18.7–30.3; 1,899)</w:t>
             </w:r>
           </w:p>
         </w:tc>
@@ -5704,7 +6046,7 @@
           <w:p>
             <w:pPr/>
             <w:r>
-              <w:t xml:space="preserve">27.8 (23.2–32.5; 2,500)</w:t>
+              <w:t xml:space="preserve">27.9 (23.4–32.7; 2,509)</w:t>
             </w:r>
           </w:p>
         </w:tc>
@@ -5715,7 +6057,7 @@
           <w:p>
             <w:pPr/>
             <w:r>
-              <w:t xml:space="preserve">4.4 (3.3–5.7; 3,861)</w:t>
+              <w:t xml:space="preserve">4.4 (3.3–5.8; 3,914)</w:t>
             </w:r>
           </w:p>
         </w:tc>
@@ -5739,7 +6081,7 @@
           <w:p>
             <w:pPr/>
             <w:r>
-              <w:t xml:space="preserve">27.3 (20.9–33.9; 1,668)</w:t>
+              <w:t xml:space="preserve">27.3 (20.7–34.1; 1,648)</w:t>
             </w:r>
           </w:p>
         </w:tc>
@@ -5750,7 +6092,7 @@
           <w:p>
             <w:pPr/>
             <w:r>
-              <w:t xml:space="preserve">30.5 (25.5–35.9; 2,223)</w:t>
+              <w:t xml:space="preserve">31.0 (25.8–36.4; 2,218)</w:t>
             </w:r>
           </w:p>
         </w:tc>
@@ -5761,7 +6103,7 @@
           <w:p>
             <w:pPr/>
             <w:r>
-              <w:t xml:space="preserve">4.8 (3.4–6.3; 3,264)</w:t>
+              <w:t xml:space="preserve">4.8 (3.4–6.3; 3,304)</w:t>
             </w:r>
           </w:p>
         </w:tc>
@@ -5785,7 +6127,7 @@
           <w:p>
             <w:pPr/>
             <w:r>
-              <w:t xml:space="preserve">22.3 (17.0–28.1; 2,021)</w:t>
+              <w:t xml:space="preserve">22.4 (17.0–28.3; 1,995)</w:t>
             </w:r>
           </w:p>
         </w:tc>
@@ -5796,7 +6138,7 @@
           <w:p>
             <w:pPr/>
             <w:r>
-              <w:t xml:space="preserve">24.3 (20.0–28.8; 2,830)</w:t>
+              <w:t xml:space="preserve">24.5 (20.1–29.0; 2,844)</w:t>
             </w:r>
           </w:p>
         </w:tc>
@@ -5807,7 +6149,7 @@
           <w:p>
             <w:pPr/>
             <w:r>
-              <w:t xml:space="preserve">4.1 (3.0–5.3; 4,384)</w:t>
+              <w:t xml:space="preserve">4.2 (3.1–5.4; 4,451)</w:t>
             </w:r>
           </w:p>
         </w:tc>
@@ -5834,7 +6176,7 @@
           <w:p>
             <w:pPr/>
             <w:r>
-              <w:t xml:space="preserve">24.2 (18.3–30.1; 1,861)</w:t>
+              <w:t xml:space="preserve">24.3 (18.4–30.3; 1,834)</w:t>
             </w:r>
           </w:p>
         </w:tc>
@@ -5845,7 +6187,7 @@
           <w:p>
             <w:pPr/>
             <w:r>
-              <w:t xml:space="preserve">27.6 (22.8–32.4; 2,475)</w:t>
+              <w:t xml:space="preserve">27.7 (23.0–32.5; 2,483)</w:t>
             </w:r>
           </w:p>
         </w:tc>
@@ -5856,7 +6198,7 @@
           <w:p>
             <w:pPr/>
             <w:r>
-              <w:t xml:space="preserve">4.4 (3.2–5.8; 3,791)</w:t>
+              <w:t xml:space="preserve">4.4 (3.2–5.8; 3,844)</w:t>
             </w:r>
           </w:p>
         </w:tc>
@@ -5880,7 +6222,7 @@
           <w:p>
             <w:pPr/>
             <w:r>
-              <w:t xml:space="preserve">26.7 (20.2–33.3; 1,653)</w:t>
+              <w:t xml:space="preserve">26.7 (20.1–33.4; 1,633)</w:t>
             </w:r>
           </w:p>
         </w:tc>
@@ -5891,7 +6233,7 @@
           <w:p>
             <w:pPr/>
             <w:r>
-              <w:t xml:space="preserve">30.4 (25.2–35.6; 2,218)</w:t>
+              <w:t xml:space="preserve">30.8 (25.5–36.1; 2,213)</w:t>
             </w:r>
           </w:p>
         </w:tc>
@@ -5902,7 +6244,7 @@
           <w:p>
             <w:pPr/>
             <w:r>
-              <w:t xml:space="preserve">4.7 (3.4–6.3; 3,259)</w:t>
+              <w:t xml:space="preserve">4.7 (3.4–6.3; 3,298)</w:t>
             </w:r>
           </w:p>
         </w:tc>
@@ -5926,7 +6268,7 @@
           <w:p>
             <w:pPr/>
             <w:r>
-              <w:t xml:space="preserve">22.9 (17.2–29.0; 1,887)</w:t>
+              <w:t xml:space="preserve">23.1 (17.3–29.3; 1,857)</w:t>
             </w:r>
           </w:p>
         </w:tc>
@@ -5937,7 +6279,7 @@
           <w:p>
             <w:pPr/>
             <w:r>
-              <w:t xml:space="preserve">25.2 (20.7–29.9; 2,638)</w:t>
+              <w:t xml:space="preserve">25.5 (21.0–30.2; 2,649)</w:t>
             </w:r>
           </w:p>
         </w:tc>
@@ -5948,7 +6290,7 @@
           <w:p>
             <w:pPr/>
             <w:r>
-              <w:t xml:space="preserve">4.2 (3.0–5.4; 4,065)</w:t>
+              <w:t xml:space="preserve">4.2 (3.1–5.5; 4,121)</w:t>
             </w:r>
           </w:p>
         </w:tc>
@@ -5972,7 +6314,7 @@
           <w:p>
             <w:pPr/>
             <w:r>
-              <w:t xml:space="preserve">24.0 (18.1–30.2; 1,798)</w:t>
+              <w:t xml:space="preserve">24.1 (18.2–30.5; 1,769)</w:t>
             </w:r>
           </w:p>
         </w:tc>
@@ -5983,7 +6325,7 @@
           <w:p>
             <w:pPr/>
             <w:r>
-              <w:t xml:space="preserve">27.7 (22.9–32.7; 2,380)</w:t>
+              <w:t xml:space="preserve">28.0 (23.1–33.0; 2,391)</w:t>
             </w:r>
           </w:p>
         </w:tc>
@@ -5994,7 +6336,7 @@
           <w:p>
             <w:pPr/>
             <w:r>
-              <w:t xml:space="preserve">4.4 (3.2–5.9; 3,669)</w:t>
+              <w:t xml:space="preserve">4.5 (3.2–5.9; 3,717)</w:t>
             </w:r>
           </w:p>
         </w:tc>
@@ -6018,7 +6360,7 @@
           <w:p>
             <w:pPr/>
             <w:r>
-              <w:t xml:space="preserve">26.1 (19.7–32.8; 1,621)</w:t>
+              <w:t xml:space="preserve">26.1 (19.7–33.0; 1,599)</w:t>
             </w:r>
           </w:p>
         </w:tc>
@@ -6029,7 +6371,7 @@
           <w:p>
             <w:pPr/>
             <w:r>
-              <w:t xml:space="preserve">30.0 (24.9–35.4; 2,185)</w:t>
+              <w:t xml:space="preserve">30.4 (25.2–36.0; 2,181)</w:t>
             </w:r>
           </w:p>
         </w:tc>
@@ -6040,7 +6382,7 @@
           <w:p>
             <w:pPr/>
             <w:r>
-              <w:t xml:space="preserve">4.7 (3.4–6.3; 3,215)</w:t>
+              <w:t xml:space="preserve">4.7 (3.4–6.3; 3,251)</w:t>
             </w:r>
           </w:p>
         </w:tc>
@@ -6064,7 +6406,7 @@
           <w:p>
             <w:pPr/>
             <w:r>
-              <w:t xml:space="preserve">22.7 (16.7–28.7; 1,799)</w:t>
+              <w:t xml:space="preserve">22.9 (16.7–29.1; 1,762)</w:t>
             </w:r>
           </w:p>
         </w:tc>
@@ -6075,7 +6417,7 @@
           <w:p>
             <w:pPr/>
             <w:r>
-              <w:t xml:space="preserve">25.7 (21.0–30.5; 2,541)</w:t>
+              <w:t xml:space="preserve">26.0 (21.3–30.9; 2,546)</w:t>
             </w:r>
           </w:p>
         </w:tc>
@@ -6086,7 +6428,7 @@
           <w:p>
             <w:pPr/>
             <w:r>
-              <w:t xml:space="preserve">4.1 (3.0–5.4; 3,818)</w:t>
+              <w:t xml:space="preserve">4.2 (3.0–5.5; 3,873)</w:t>
             </w:r>
           </w:p>
         </w:tc>
@@ -6110,7 +6452,7 @@
           <w:p>
             <w:pPr/>
             <w:r>
-              <w:t xml:space="preserve">23.6 (17.4–29.8; 1,731)</w:t>
+              <w:t xml:space="preserve">23.7 (17.5–30.1; 1,697)</w:t>
             </w:r>
           </w:p>
         </w:tc>
@@ -6121,7 +6463,7 @@
           <w:p>
             <w:pPr/>
             <w:r>
-              <w:t xml:space="preserve">27.9 (23.0–32.9; 2,322)</w:t>
+              <w:t xml:space="preserve">28.3 (23.2–33.4; 2,325)</w:t>
             </w:r>
           </w:p>
         </w:tc>
@@ -6132,7 +6474,7 @@
           <w:p>
             <w:pPr/>
             <w:r>
-              <w:t xml:space="preserve">4.3 (3.1–5.8; 3,498)</w:t>
+              <w:t xml:space="preserve">4.4 (3.1–5.8; 3,543)</w:t>
             </w:r>
           </w:p>
         </w:tc>
@@ -6156,7 +6498,7 @@
           <w:p>
             <w:pPr/>
             <w:r>
-              <w:t xml:space="preserve">25.8 (19.3–32.7; 1,576)</w:t>
+              <w:t xml:space="preserve">25.9 (19.2–33.0; 1,551)</w:t>
             </w:r>
           </w:p>
         </w:tc>
@@ -6167,7 +6509,7 @@
           <w:p>
             <w:pPr/>
             <w:r>
-              <w:t xml:space="preserve">30.0 (24.9–35.4; 2,148)</w:t>
+              <w:t xml:space="preserve">30.5 (25.2–36.0; 2,144)</w:t>
             </w:r>
           </w:p>
         </w:tc>
@@ -6178,7 +6520,7 @@
           <w:p>
             <w:pPr/>
             <w:r>
-              <w:t xml:space="preserve">4.5 (3.2–6.1; 3,129)</w:t>
+              <w:t xml:space="preserve">4.5 (3.2–6.1; 3,164)</w:t>
             </w:r>
           </w:p>
         </w:tc>
@@ -6202,7 +6544,7 @@
           <w:p>
             <w:pPr/>
             <w:r>
-              <w:t xml:space="preserve">30.8 (23.0–38.3; 1,265)</w:t>
+              <w:t xml:space="preserve">31.0 (23.0–38.7; 1,237)</w:t>
             </w:r>
           </w:p>
         </w:tc>
@@ -6213,7 +6555,7 @@
           <w:p>
             <w:pPr/>
             <w:r>
-              <w:t xml:space="preserve">33.9 (27.9–39.9; 1,784)</w:t>
+              <w:t xml:space="preserve">34.1 (28.1–40.1; 1,788)</w:t>
             </w:r>
           </w:p>
         </w:tc>
@@ -6224,7 +6566,7 @@
           <w:p>
             <w:pPr/>
             <w:r>
-              <w:t xml:space="preserve">4.9 (3.4–6.6; 2,845)</w:t>
+              <w:t xml:space="preserve">4.8 (3.4–6.5; 2,905)</w:t>
             </w:r>
           </w:p>
         </w:tc>

</xml_diff>

<commit_message>
Preprint v3 figures regenerated by the author with the production model; Word export updated
</commit_message>
<xml_diff>
--- a/docs/preprint/OREVID_preprint_v3_draft.docx
+++ b/docs/preprint/OREVID_preprint_v3_draft.docx
@@ -2313,7 +2313,7 @@
       <w:r>
         <w:drawing>
           <wp:inline distT="0" distB="0" distL="0" distR="0">
-            <wp:extent cx="5486400" cy="3330435"/>
+            <wp:extent cx="5486400" cy="3334218"/>
             <wp:docPr id="4" name="image4" descr="Figure 4: Hit rate among the top 25 candidates, by website section"/>
             <a:graphic xmlns:a="http://schemas.openxmlformats.org/drawingml/2006/main">
               <a:graphicData uri="http://schemas.openxmlformats.org/drawingml/2006/picture">
@@ -2331,7 +2331,7 @@
                   <pic:spPr>
                     <a:xfrm>
                       <a:off x="0" y="0"/>
-                      <a:ext cx="5486400" cy="3330435"/>
+                      <a:ext cx="5486400" cy="3334218"/>
                     </a:xfrm>
                     <a:prstGeom prst="rect">
                       <a:avLst/>

</xml_diff>